<commit_message>
[Docs] Add missing code style guidelines and upgrade documentation
</commit_message>
<xml_diff>
--- a/documents/full-guide.docx
+++ b/documents/full-guide.docx
@@ -145,7 +145,7 @@
                       <a:picLocks noChangeAspect="1"/>
                       <a:extLst>
                         <a:ext uri="sm">
-                          <sm:smNativeData xmlns:sm="sm" val="SMDATA_17_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"/>
+                          <sm:smNativeData xmlns:sm="sm" val="SMDATA_17_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"/>
                         </a:ext>
                       </a:extLst>
                     </pic:cNvPicPr>
@@ -2778,7 +2778,7 @@
                       <a:picLocks noChangeAspect="1"/>
                       <a:extLst>
                         <a:ext uri="sm">
-                          <sm:smNativeData xmlns:sm="sm" val="SMDATA_17_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"/>
+                          <sm:smNativeData xmlns:sm="sm" val="SMDATA_17_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"/>
                         </a:ext>
                       </a:extLst>
                     </pic:cNvPicPr>
@@ -2844,6 +2844,7 @@
       <w:r>
         <w:rPr>
           <w:rStyle w:val="char11"/>
+          <w:rFonts w:eastAsia="Roboto Condensed ExtraLight" w:cs="Roboto Condensed ExtraLight"/>
         </w:rPr>
         <w:t xml:space="preserve"> header </w:t>
       </w:r>
@@ -2964,6 +2965,7 @@
       <w:r>
         <w:rPr>
           <w:rStyle w:val="char11"/>
+          <w:rFonts w:eastAsia="Roboto Condensed ExtraLight" w:cs="Roboto Condensed ExtraLight"/>
         </w:rPr>
         <w:t xml:space="preserve"> NomeProgetto.NomeCartella </w:t>
       </w:r>
@@ -2986,6 +2988,7 @@
       <w:r>
         <w:rPr>
           <w:rStyle w:val="char11"/>
+          <w:rFonts w:eastAsia="Roboto Condensed ExtraLight" w:cs="Roboto Condensed ExtraLight"/>
         </w:rPr>
         <w:t xml:space="preserve"> { </w:t>
       </w:r>
@@ -3125,6 +3128,7 @@
       <w:r>
         <w:rPr>
           <w:rStyle w:val="char11"/>
+          <w:rFonts w:eastAsia="Roboto Condensed ExtraLight" w:cs="Roboto Condensed ExtraLight"/>
         </w:rPr>
         <w:t xml:space="preserve"> if </w:t>
       </w:r>
@@ -3134,6 +3138,7 @@
       <w:r>
         <w:rPr>
           <w:rStyle w:val="char11"/>
+          <w:rFonts w:eastAsia="Roboto Condensed ExtraLight" w:cs="Roboto Condensed ExtraLight"/>
         </w:rPr>
         <w:t xml:space="preserve"> else </w:t>
       </w:r>
@@ -3143,6 +3148,7 @@
       <w:r>
         <w:rPr>
           <w:rStyle w:val="char11"/>
+          <w:rFonts w:eastAsia="Roboto Condensed ExtraLight" w:cs="Roboto Condensed ExtraLight"/>
         </w:rPr>
         <w:t xml:space="preserve"> for </w:t>
       </w:r>
@@ -3152,12 +3158,14 @@
       <w:r>
         <w:rPr>
           <w:rStyle w:val="char11"/>
+          <w:rFonts w:eastAsia="Roboto Condensed ExtraLight" w:cs="Roboto Condensed ExtraLight"/>
         </w:rPr>
         <w:t xml:space="preserve"> whil</w:t>
       </w:r>
       <w:r>
         <w:rPr>
           <w:rStyle w:val="char11"/>
+          <w:rFonts w:eastAsia="Roboto Condensed ExtraLight" w:cs="Roboto Condensed ExtraLight"/>
         </w:rPr>
         <w:t xml:space="preserve">e </w:t>
       </w:r>
@@ -3167,6 +3175,7 @@
       <w:r>
         <w:rPr>
           <w:rStyle w:val="char11"/>
+          <w:rFonts w:eastAsia="Roboto Condensed ExtraLight" w:cs="Roboto Condensed ExtraLight"/>
         </w:rPr>
         <w:t xml:space="preserve"> switch </w:t>
       </w:r>
@@ -3195,6 +3204,7 @@
       <w:r>
         <w:rPr>
           <w:rStyle w:val="char11"/>
+          <w:rFonts w:eastAsia="Roboto Condensed ExtraLight" w:cs="Roboto Condensed ExtraLight"/>
         </w:rPr>
         <w:t xml:space="preserve"> else </w:t>
       </w:r>
@@ -3204,6 +3214,7 @@
       <w:r>
         <w:rPr>
           <w:rStyle w:val="char11"/>
+          <w:rFonts w:eastAsia="Roboto Condensed ExtraLight" w:cs="Roboto Condensed ExtraLight"/>
         </w:rPr>
         <w:t xml:space="preserve"> } </w:t>
       </w:r>
@@ -3213,6 +3224,7 @@
       <w:r>
         <w:rPr>
           <w:rStyle w:val="char11"/>
+          <w:rFonts w:eastAsia="Roboto Condensed ExtraLight" w:cs="Roboto Condensed ExtraLight"/>
         </w:rPr>
         <w:t xml:space="preserve"> if </w:t>
       </w:r>
@@ -3501,6 +3513,7 @@
       <w:r>
         <w:rPr>
           <w:rStyle w:val="char11"/>
+          <w:rFonts w:eastAsia="Roboto Condensed ExtraLight" w:cs="Roboto Condensed ExtraLight"/>
         </w:rPr>
         <w:t xml:space="preserve">args </w:t>
       </w:r>
@@ -3510,6 +3523,7 @@
       <w:r>
         <w:rPr>
           <w:rStyle w:val="char11"/>
+          <w:rFonts w:eastAsia="Roboto Condensed ExtraLight" w:cs="Roboto Condensed ExtraLight"/>
         </w:rPr>
         <w:t xml:space="preserve"> i </w:t>
       </w:r>
@@ -3519,6 +3533,7 @@
       <w:r>
         <w:rPr>
           <w:rStyle w:val="char11"/>
+          <w:rFonts w:eastAsia="Roboto Condensed ExtraLight" w:cs="Roboto Condensed ExtraLight"/>
         </w:rPr>
         <w:t xml:space="preserve"> p </w:t>
       </w:r>
@@ -3541,6 +3556,7 @@
       <w:r>
         <w:rPr>
           <w:rStyle w:val="char11"/>
+          <w:rFonts w:eastAsia="Roboto Condensed ExtraLight" w:cs="Roboto Condensed ExtraLight"/>
         </w:rPr>
         <w:t xml:space="preserve"> p_ </w:t>
       </w:r>
@@ -3563,6 +3579,7 @@
       <w:r>
         <w:rPr>
           <w:rStyle w:val="char11"/>
+          <w:rFonts w:eastAsia="Roboto Condensed ExtraLight" w:cs="Roboto Condensed ExtraLight"/>
         </w:rPr>
         <w:t xml:space="preserve"> f_ </w:t>
       </w:r>
@@ -3585,6 +3602,7 @@
       <w:r>
         <w:rPr>
           <w:rStyle w:val="char11"/>
+          <w:rFonts w:eastAsia="Roboto Condensed ExtraLight" w:cs="Roboto Condensed ExtraLight"/>
         </w:rPr>
         <w:t xml:space="preserve"> l_ </w:t>
       </w:r>
@@ -4165,6 +4183,7 @@
       <w:r>
         <w:rPr>
           <w:rStyle w:val="char11"/>
+          <w:rFonts w:eastAsia="Roboto Condensed ExtraLight" w:cs="Roboto Condensed ExtraLight"/>
           <w:highlight w:val="lightGray"/>
         </w:rPr>
         <w:t>)</w:t>
@@ -4190,6 +4209,7 @@
       <w:r>
         <w:rPr>
           <w:rStyle w:val="char11"/>
+          <w:rFonts w:eastAsia="Roboto Condensed ExtraLight" w:cs="Roboto Condensed ExtraLight"/>
           <w:highlight w:val="lightGray"/>
         </w:rPr>
         <w:t>(</w:t>
@@ -4215,6 +4235,7 @@
       <w:r>
         <w:rPr>
           <w:rStyle w:val="char11"/>
+          <w:rFonts w:eastAsia="Roboto Condensed ExtraLight" w:cs="Roboto Condensed ExtraLight"/>
           <w:highlight w:val="lightGray"/>
         </w:rPr>
         <w:t>{</w:t>
@@ -4277,6 +4298,7 @@
       <w:r>
         <w:rPr>
           <w:rStyle w:val="char11"/>
+          <w:rFonts w:eastAsia="Roboto Condensed ExtraLight" w:cs="Roboto Condensed ExtraLight"/>
           <w:highlight w:val="lightGray"/>
         </w:rPr>
         <w:t>)</w:t>
@@ -4302,6 +4324,7 @@
       <w:r>
         <w:rPr>
           <w:rStyle w:val="char11"/>
+          <w:rFonts w:eastAsia="Roboto Condensed ExtraLight" w:cs="Roboto Condensed ExtraLight"/>
           <w:highlight w:val="lightGray"/>
         </w:rPr>
         <w:t>{</w:t>
@@ -4378,6 +4401,7 @@
       <w:r>
         <w:rPr>
           <w:rStyle w:val="char11"/>
+          <w:rFonts w:eastAsia="Roboto Condensed ExtraLight" w:cs="Roboto Condensed ExtraLight"/>
           <w:highlight w:val="lightGray"/>
         </w:rPr>
         <w:t>,</w:t>
@@ -4403,6 +4427,7 @@
       <w:r>
         <w:rPr>
           <w:rStyle w:val="char11"/>
+          <w:rFonts w:eastAsia="Roboto Condensed ExtraLight" w:cs="Roboto Condensed ExtraLight"/>
           <w:highlight w:val="lightGray"/>
         </w:rPr>
         <w:t>)</w:t>
@@ -4428,6 +4453,7 @@
       <w:r>
         <w:rPr>
           <w:rStyle w:val="char11"/>
+          <w:rFonts w:eastAsia="Roboto Condensed ExtraLight" w:cs="Roboto Condensed ExtraLight"/>
           <w:highlight w:val="lightGray"/>
         </w:rPr>
         <w:t>}</w:t>
@@ -4612,7 +4638,7 @@
     </w:p>
     <w:p>
       <w:pPr>
-        <w:pStyle w:val="para23"/>
+        <w:pStyle w:val="para22"/>
         <w:numPr>
           <w:ilvl w:val="0"/>
           <w:numId w:val="5"/>
@@ -4628,10 +4654,15 @@
         </w:rPr>
         <w:t>Microsoft Visual Studio</w:t>
       </w:r>
-    </w:p>
-    <w:p>
-      <w:pPr>
-        <w:pStyle w:val="para23"/>
+      <w:r>
+        <w:rPr>
+          <w:rFonts w:ascii="Roboto Condensed" w:hAnsi="Roboto Condensed" w:eastAsia="Roboto Condensed" w:cs="Roboto Condensed"/>
+        </w:rPr>
+      </w:r>
+    </w:p>
+    <w:p>
+      <w:pPr>
+        <w:pStyle w:val="para22"/>
         <w:numPr>
           <w:ilvl w:val="0"/>
           <w:numId w:val="5"/>
@@ -4647,10 +4678,15 @@
         </w:rPr>
         <w:t>Microsoft Visual Studio Code</w:t>
       </w:r>
-    </w:p>
-    <w:p>
-      <w:pPr>
-        <w:pStyle w:val="para23"/>
+      <w:r>
+        <w:rPr>
+          <w:rFonts w:ascii="Roboto Condensed" w:hAnsi="Roboto Condensed" w:eastAsia="Roboto Condensed" w:cs="Roboto Condensed"/>
+        </w:rPr>
+      </w:r>
+    </w:p>
+    <w:p>
+      <w:pPr>
+        <w:pStyle w:val="para22"/>
         <w:numPr>
           <w:ilvl w:val="0"/>
           <w:numId w:val="5"/>
@@ -4665,6 +4701,11 @@
           <w:rStyle w:val="char6"/>
         </w:rPr>
         <w:t>JetBrains Rider</w:t>
+      </w:r>
+      <w:r>
+        <w:rPr>
+          <w:rFonts w:ascii="Roboto Condensed" w:hAnsi="Roboto Condensed" w:eastAsia="Roboto Condensed" w:cs="Roboto Condensed"/>
+        </w:rPr>
       </w:r>
     </w:p>
     <w:p>
@@ -4719,6 +4760,7 @@
       <w:r>
         <w:rPr>
           <w:rStyle w:val="char4"/>
+          <w:i/>
         </w:rPr>
         <w:t>workload</w:t>
       </w:r>
@@ -4758,6 +4800,7 @@
       <w:r>
         <w:rPr>
           <w:rStyle w:val="char4"/>
+          <w:i/>
         </w:rPr>
         <w:t>debugging</w:t>
       </w:r>
@@ -4767,6 +4810,7 @@
       <w:r>
         <w:rPr>
           <w:rStyle w:val="char4"/>
+          <w:i/>
         </w:rPr>
         <w:t>scaffolding</w:t>
       </w:r>
@@ -4794,6 +4838,7 @@
       <w:r>
         <w:rPr>
           <w:rStyle w:val="char4"/>
+          <w:i/>
         </w:rPr>
         <w:t>Refactoring</w:t>
       </w:r>
@@ -4826,6 +4871,7 @@
       <w:r>
         <w:rPr>
           <w:rStyle w:val="char20"/>
+          <w:shd w:val="clear" w:fill="auto"/>
         </w:rPr>
         <w:t> wasm-tools </w:t>
       </w:r>
@@ -4951,6 +4997,7 @@
       <w:r>
         <w:rPr>
           <w:rStyle w:val="char4"/>
+          <w:i/>
         </w:rPr>
         <w:t>CLI-driven</w:t>
       </w:r>
@@ -4960,6 +5007,7 @@
       <w:r>
         <w:rPr>
           <w:rStyle w:val="char4"/>
+          <w:i/>
         </w:rPr>
         <w:t>Command Line Interface</w:t>
       </w:r>
@@ -4982,6 +5030,7 @@
       <w:r>
         <w:rPr>
           <w:rStyle w:val="char4"/>
+          <w:i/>
         </w:rPr>
         <w:t>naming</w:t>
       </w:r>
@@ -4991,6 +5040,7 @@
       <w:r>
         <w:rPr>
           <w:rStyle w:val="char4"/>
+          <w:i/>
         </w:rPr>
         <w:t>refactoring</w:t>
       </w:r>
@@ -5009,7 +5059,7 @@
     </w:p>
     <w:p>
       <w:pPr>
-        <w:pStyle w:val="para23"/>
+        <w:pStyle w:val="para22"/>
         <w:numPr>
           <w:ilvl w:val="0"/>
           <w:numId w:val="5"/>
@@ -5022,6 +5072,7 @@
       <w:r>
         <w:rPr>
           <w:rStyle w:val="char4"/>
+          <w:i/>
         </w:rPr>
         <w:t>layer</w:t>
       </w:r>
@@ -5029,7 +5080,7 @@
     </w:p>
     <w:p>
       <w:pPr>
-        <w:pStyle w:val="para23"/>
+        <w:pStyle w:val="para22"/>
         <w:numPr>
           <w:ilvl w:val="0"/>
           <w:numId w:val="5"/>
@@ -5042,7 +5093,7 @@
     </w:p>
     <w:p>
       <w:pPr>
-        <w:pStyle w:val="para23"/>
+        <w:pStyle w:val="para22"/>
         <w:numPr>
           <w:ilvl w:val="0"/>
           <w:numId w:val="5"/>
@@ -5055,6 +5106,7 @@
       <w:r>
         <w:rPr>
           <w:rStyle w:val="char4"/>
+          <w:i/>
         </w:rPr>
         <w:t>CLI</w:t>
       </w:r>
@@ -5062,7 +5114,7 @@
     </w:p>
     <w:p>
       <w:pPr>
-        <w:pStyle w:val="para23"/>
+        <w:pStyle w:val="para22"/>
         <w:numPr>
           <w:ilvl w:val="0"/>
           <w:numId w:val="5"/>
@@ -5078,10 +5130,11 @@
         </w:rPr>
         <w:t>Blazor WebAssembly</w:t>
       </w:r>
-    </w:p>
-    <w:p>
-      <w:pPr>
-        <w:pStyle w:val="para23"/>
+      <w:r/>
+    </w:p>
+    <w:p>
+      <w:pPr>
+        <w:pStyle w:val="para22"/>
         <w:numPr>
           <w:ilvl w:val="0"/>
           <w:numId w:val="5"/>
@@ -5094,6 +5147,7 @@
       <w:r>
         <w:rPr>
           <w:rStyle w:val="char4"/>
+          <w:i/>
         </w:rPr>
         <w:t>open source</w:t>
       </w:r>
@@ -5101,7 +5155,7 @@
     </w:p>
     <w:p>
       <w:pPr>
-        <w:pStyle w:val="para23"/>
+        <w:pStyle w:val="para22"/>
         <w:numPr>
           <w:ilvl w:val="0"/>
           <w:numId w:val="5"/>
@@ -5247,6 +5301,7 @@
       <w:r>
         <w:rPr>
           <w:rStyle w:val="char4"/>
+          <w:i/>
         </w:rPr>
         <w:t>layout</w:t>
       </w:r>
@@ -5256,6 +5311,7 @@
       <w:r>
         <w:rPr>
           <w:rStyle w:val="char4"/>
+          <w:i/>
         </w:rPr>
         <w:t>client-side</w:t>
       </w:r>
@@ -5325,7 +5381,7 @@
                       <a:picLocks noChangeAspect="1"/>
                       <a:extLst>
                         <a:ext uri="sm">
-                          <sm:smNativeData xmlns:sm="sm" val="SMDATA_17_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"/>
+                          <sm:smNativeData xmlns:sm="sm" val="SMDATA_17_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"/>
                         </a:ext>
                       </a:extLst>
                     </pic:cNvPicPr>
@@ -5387,6 +5443,7 @@
       <w:r>
         <w:rPr>
           <w:rStyle w:val="char4"/>
+          <w:i/>
         </w:rPr>
         <w:t>clic</w:t>
       </w:r>
@@ -5425,7 +5482,7 @@
                       <a:picLocks noChangeAspect="1"/>
                       <a:extLst>
                         <a:ext uri="sm">
-                          <sm:smNativeData xmlns:sm="sm" val="SMDATA_17_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"/>
+                          <sm:smNativeData xmlns:sm="sm" val="SMDATA_17_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"/>
                         </a:ext>
                       </a:extLst>
                     </pic:cNvPicPr>
@@ -5469,6 +5526,7 @@
       <w:r>
         <w:rPr>
           <w:rStyle w:val="char4"/>
+          <w:i/>
         </w:rPr>
         <w:t>backup</w:t>
       </w:r>
@@ -5487,6 +5545,7 @@
       <w:r>
         <w:rPr>
           <w:rStyle w:val="char4"/>
+          <w:i/>
         </w:rPr>
         <w:t>clic</w:t>
       </w:r>
@@ -5525,7 +5584,7 @@
                       <a:picLocks noChangeAspect="1"/>
                       <a:extLst>
                         <a:ext uri="sm">
-                          <sm:smNativeData xmlns:sm="sm" val="SMDATA_17_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"/>
+                          <sm:smNativeData xmlns:sm="sm" val="SMDATA_17_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"/>
                         </a:ext>
                       </a:extLst>
                     </pic:cNvPicPr>
@@ -5569,6 +5628,7 @@
       <w:r>
         <w:rPr>
           <w:rStyle w:val="char4"/>
+          <w:i/>
         </w:rPr>
         <w:t>clic</w:t>
       </w:r>
@@ -5743,7 +5803,7 @@
                       <a:picLocks noChangeAspect="1"/>
                       <a:extLst>
                         <a:ext uri="sm">
-                          <sm:smNativeData xmlns:sm="sm" val="SMDATA_17_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"/>
+                          <sm:smNativeData xmlns:sm="sm" val="SMDATA_17_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"/>
                         </a:ext>
                       </a:extLst>
                     </pic:cNvPicPr>
@@ -5830,7 +5890,7 @@
                       <a:picLocks noChangeAspect="1"/>
                       <a:extLst>
                         <a:ext uri="sm">
-                          <sm:smNativeData xmlns:sm="sm" val="SMDATA_17_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"/>
+                          <sm:smNativeData xmlns:sm="sm" val="SMDATA_17_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"/>
                         </a:ext>
                       </a:extLst>
                     </pic:cNvPicPr>
@@ -5899,7 +5959,7 @@
                       <a:picLocks noChangeAspect="1"/>
                       <a:extLst>
                         <a:ext uri="sm">
-                          <sm:smNativeData xmlns:sm="sm" val="SMDATA_17_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"/>
+                          <sm:smNativeData xmlns:sm="sm" val="SMDATA_17_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"/>
                         </a:ext>
                       </a:extLst>
                     </pic:cNvPicPr>
@@ -5980,7 +6040,7 @@
                       <a:picLocks noChangeAspect="1"/>
                       <a:extLst>
                         <a:ext uri="sm">
-                          <sm:smNativeData xmlns:sm="sm" val="SMDATA_17_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"/>
+                          <sm:smNativeData xmlns:sm="sm" val="SMDATA_17_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"/>
                         </a:ext>
                       </a:extLst>
                     </pic:cNvPicPr>
@@ -6066,7 +6126,7 @@
                       <a:picLocks noChangeAspect="1"/>
                       <a:extLst>
                         <a:ext uri="sm">
-                          <sm:smNativeData xmlns:sm="sm" val="SMDATA_17_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"/>
+                          <sm:smNativeData xmlns:sm="sm" val="SMDATA_17_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"/>
                         </a:ext>
                       </a:extLst>
                     </pic:cNvPicPr>
@@ -6164,7 +6224,7 @@
                       <a:picLocks noChangeAspect="1"/>
                       <a:extLst>
                         <a:ext uri="sm">
-                          <sm:smNativeData xmlns:sm="sm" val="SMDATA_17_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"/>
+                          <sm:smNativeData xmlns:sm="sm" val="SMDATA_17_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"/>
                         </a:ext>
                       </a:extLst>
                     </pic:cNvPicPr>
@@ -6311,7 +6371,7 @@
                       <a:picLocks noChangeAspect="1"/>
                       <a:extLst>
                         <a:ext uri="sm">
-                          <sm:smNativeData xmlns:sm="sm" val="SMDATA_17_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"/>
+                          <sm:smNativeData xmlns:sm="sm" val="SMDATA_17_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"/>
                         </a:ext>
                       </a:extLst>
                     </pic:cNvPicPr>
@@ -6398,7 +6458,7 @@
                       <a:picLocks noChangeAspect="1"/>
                       <a:extLst>
                         <a:ext uri="sm">
-                          <sm:smNativeData xmlns:sm="sm" val="SMDATA_17_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"/>
+                          <sm:smNativeData xmlns:sm="sm" val="SMDATA_17_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"/>
                         </a:ext>
                       </a:extLst>
                     </pic:cNvPicPr>
@@ -6476,7 +6536,7 @@
                       <a:picLocks noChangeAspect="1"/>
                       <a:extLst>
                         <a:ext uri="sm">
-                          <sm:smNativeData xmlns:sm="sm" val="SMDATA_17_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"/>
+                          <sm:smNativeData xmlns:sm="sm" val="SMDATA_17_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"/>
                         </a:ext>
                       </a:extLst>
                     </pic:cNvPicPr>
@@ -6554,7 +6614,7 @@
                       <a:picLocks noChangeAspect="1"/>
                       <a:extLst>
                         <a:ext uri="sm">
-                          <sm:smNativeData xmlns:sm="sm" val="SMDATA_17_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"/>
+                          <sm:smNativeData xmlns:sm="sm" val="SMDATA_17_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"/>
                         </a:ext>
                       </a:extLst>
                     </pic:cNvPicPr>
@@ -6626,7 +6686,7 @@
                       <a:picLocks noChangeAspect="1"/>
                       <a:extLst>
                         <a:ext uri="sm">
-                          <sm:smNativeData xmlns:sm="sm" val="SMDATA_17_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"/>
+                          <sm:smNativeData xmlns:sm="sm" val="SMDATA_17_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"/>
                         </a:ext>
                       </a:extLst>
                     </pic:cNvPicPr>
@@ -6717,7 +6777,7 @@
                       <a:picLocks noChangeAspect="1"/>
                       <a:extLst>
                         <a:ext uri="sm">
-                          <sm:smNativeData xmlns:sm="sm" val="SMDATA_17_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"/>
+                          <sm:smNativeData xmlns:sm="sm" val="SMDATA_17_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"/>
                         </a:ext>
                       </a:extLst>
                     </pic:cNvPicPr>
@@ -6796,7 +6856,7 @@
                       <a:picLocks noChangeAspect="1"/>
                       <a:extLst>
                         <a:ext uri="sm">
-                          <sm:smNativeData xmlns:sm="sm" val="SMDATA_17_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"/>
+                          <sm:smNativeData xmlns:sm="sm" val="SMDATA_17_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"/>
                         </a:ext>
                       </a:extLst>
                     </pic:cNvPicPr>
@@ -6925,7 +6985,7 @@
                       <a:picLocks noChangeAspect="1"/>
                       <a:extLst>
                         <a:ext uri="sm">
-                          <sm:smNativeData xmlns:sm="sm" val="SMDATA_17_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"/>
+                          <sm:smNativeData xmlns:sm="sm" val="SMDATA_17_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"/>
                         </a:ext>
                       </a:extLst>
                     </pic:cNvPicPr>
@@ -7027,7 +7087,7 @@
                       <a:picLocks noChangeAspect="1"/>
                       <a:extLst>
                         <a:ext uri="sm">
-                          <sm:smNativeData xmlns:sm="sm" val="SMDATA_17_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"/>
+                          <sm:smNativeData xmlns:sm="sm" val="SMDATA_17_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"/>
                         </a:ext>
                       </a:extLst>
                     </pic:cNvPicPr>
@@ -8077,7 +8137,7 @@
                       <a:picLocks noChangeAspect="1"/>
                       <a:extLst>
                         <a:ext uri="sm">
-                          <sm:smNativeData xmlns:sm="sm" val="SMDATA_17_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"/>
+                          <sm:smNativeData xmlns:sm="sm" val="SMDATA_17_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"/>
                         </a:ext>
                       </a:extLst>
                     </pic:cNvPicPr>
@@ -8205,7 +8265,7 @@
                       <a:picLocks noChangeAspect="1"/>
                       <a:extLst>
                         <a:ext uri="sm">
-                          <sm:smNativeData xmlns:sm="sm" val="SMDATA_17_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"/>
+                          <sm:smNativeData xmlns:sm="sm" val="SMDATA_17_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"/>
                         </a:ext>
                       </a:extLst>
                     </pic:cNvPicPr>
@@ -8297,7 +8357,7 @@
                       <a:picLocks noChangeAspect="1"/>
                       <a:extLst>
                         <a:ext uri="sm">
-                          <sm:smNativeData xmlns:sm="sm" val="SMDATA_17_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"/>
+                          <sm:smNativeData xmlns:sm="sm" val="SMDATA_17_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"/>
                         </a:ext>
                       </a:extLst>
                     </pic:cNvPicPr>
@@ -8470,7 +8530,7 @@
                       <a:picLocks noChangeAspect="1"/>
                       <a:extLst>
                         <a:ext uri="sm">
-                          <sm:smNativeData xmlns:sm="sm" val="SMDATA_17_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"/>
+                          <sm:smNativeData xmlns:sm="sm" val="SMDATA_17_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"/>
                         </a:ext>
                       </a:extLst>
                     </pic:cNvPicPr>
@@ -8570,7 +8630,7 @@
                       <a:picLocks noChangeAspect="1"/>
                       <a:extLst>
                         <a:ext uri="sm">
-                          <sm:smNativeData xmlns:sm="sm" val="SMDATA_17_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"/>
+                          <sm:smNativeData xmlns:sm="sm" val="SMDATA_17_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"/>
                         </a:ext>
                       </a:extLst>
                     </pic:cNvPicPr>
@@ -8670,7 +8730,7 @@
                       <a:picLocks noChangeAspect="1"/>
                       <a:extLst>
                         <a:ext uri="sm">
-                          <sm:smNativeData xmlns:sm="sm" val="SMDATA_17_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"/>
+                          <sm:smNativeData xmlns:sm="sm" val="SMDATA_17_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"/>
                         </a:ext>
                       </a:extLst>
                     </pic:cNvPicPr>
@@ -8779,7 +8839,7 @@
                       <a:picLocks noChangeAspect="1"/>
                       <a:extLst>
                         <a:ext uri="sm">
-                          <sm:smNativeData xmlns:sm="sm" val="SMDATA_17_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"/>
+                          <sm:smNativeData xmlns:sm="sm" val="SMDATA_17_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"/>
                         </a:ext>
                       </a:extLst>
                     </pic:cNvPicPr>
@@ -8865,7 +8925,7 @@
                       <a:picLocks noChangeAspect="1"/>
                       <a:extLst>
                         <a:ext uri="sm">
-                          <sm:smNativeData xmlns:sm="sm" val="SMDATA_17_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"/>
+                          <sm:smNativeData xmlns:sm="sm" val="SMDATA_17_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"/>
                         </a:ext>
                       </a:extLst>
                     </pic:cNvPicPr>
@@ -9011,7 +9071,7 @@
                       <a:picLocks noChangeAspect="1"/>
                       <a:extLst>
                         <a:ext uri="sm">
-                          <sm:smNativeData xmlns:sm="sm" val="SMDATA_17_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"/>
+                          <sm:smNativeData xmlns:sm="sm" val="SMDATA_17_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"/>
                         </a:ext>
                       </a:extLst>
                     </pic:cNvPicPr>
@@ -9112,7 +9172,7 @@
                       <a:picLocks noChangeAspect="1"/>
                       <a:extLst>
                         <a:ext uri="sm">
-                          <sm:smNativeData xmlns:sm="sm" val="SMDATA_17_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"/>
+                          <sm:smNativeData xmlns:sm="sm" val="SMDATA_17_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"/>
                         </a:ext>
                       </a:extLst>
                     </pic:cNvPicPr>
@@ -9199,7 +9259,7 @@
                       <a:picLocks noChangeAspect="1"/>
                       <a:extLst>
                         <a:ext uri="sm">
-                          <sm:smNativeData xmlns:sm="sm" val="SMDATA_17_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"/>
+                          <sm:smNativeData xmlns:sm="sm" val="SMDATA_17_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"/>
                         </a:ext>
                       </a:extLst>
                     </pic:cNvPicPr>
@@ -9287,7 +9347,7 @@
                       <a:picLocks noChangeAspect="1"/>
                       <a:extLst>
                         <a:ext uri="sm">
-                          <sm:smNativeData xmlns:sm="sm" val="SMDATA_17_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"/>
+                          <sm:smNativeData xmlns:sm="sm" val="SMDATA_17_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"/>
                         </a:ext>
                       </a:extLst>
                     </pic:cNvPicPr>
@@ -9489,12 +9549,14 @@
       <w:r>
         <w:rPr>
           <w:rStyle w:val="char11"/>
+          <w:rFonts w:eastAsia="Roboto Condensed ExtraLight" w:cs="Roboto Condensed ExtraLight"/>
         </w:rPr>
         <w:t xml:space="preserve"> Progra</w:t>
       </w:r>
       <w:r>
         <w:rPr>
           <w:rStyle w:val="char11"/>
+          <w:rFonts w:eastAsia="Roboto Condensed ExtraLight" w:cs="Roboto Condensed ExtraLight"/>
         </w:rPr>
         <w:t xml:space="preserve">m </w:t>
       </w:r>
@@ -9513,12 +9575,14 @@
       <w:r>
         <w:rPr>
           <w:rStyle w:val="char11"/>
+          <w:rFonts w:eastAsia="Roboto Condensed ExtraLight" w:cs="Roboto Condensed ExtraLight"/>
         </w:rPr>
         <w:t xml:space="preserve"> Mai</w:t>
       </w:r>
       <w:r>
         <w:rPr>
           <w:rStyle w:val="char11"/>
+          <w:rFonts w:eastAsia="Roboto Condensed ExtraLight" w:cs="Roboto Condensed ExtraLight"/>
         </w:rPr>
         <w:t xml:space="preserve">n </w:t>
       </w:r>
@@ -9536,12 +9600,14 @@
       <w:r>
         <w:rPr>
           <w:rStyle w:val="char11"/>
+          <w:rFonts w:eastAsia="Roboto Condensed ExtraLight" w:cs="Roboto Condensed ExtraLight"/>
         </w:rPr>
         <w:t xml:space="preserve"> Progra</w:t>
       </w:r>
       <w:r>
         <w:rPr>
           <w:rStyle w:val="char11"/>
+          <w:rFonts w:eastAsia="Roboto Condensed ExtraLight" w:cs="Roboto Condensed ExtraLight"/>
         </w:rPr>
         <w:t xml:space="preserve">m </w:t>
       </w:r>
@@ -9813,6 +9879,7 @@
       <w:r>
         <w:rPr>
           <w:rStyle w:val="char11"/>
+          <w:rFonts w:eastAsia="Roboto Condensed ExtraLight" w:cs="Roboto Condensed ExtraLight"/>
         </w:rPr>
         <w:t xml:space="preserve"> Program </w:t>
       </w:r>
@@ -9840,12 +9907,14 @@
       <w:r>
         <w:rPr>
           <w:rStyle w:val="char11"/>
+          <w:rFonts w:eastAsia="Roboto Condensed ExtraLight" w:cs="Roboto Condensed ExtraLight"/>
         </w:rPr>
         <w:t xml:space="preserve"> Progra</w:t>
       </w:r>
       <w:r>
         <w:rPr>
           <w:rStyle w:val="char11"/>
+          <w:rFonts w:eastAsia="Roboto Condensed ExtraLight" w:cs="Roboto Condensed ExtraLight"/>
         </w:rPr>
         <w:t xml:space="preserve">m </w:t>
       </w:r>
@@ -9855,6 +9924,7 @@
       <w:r>
         <w:rPr>
           <w:rStyle w:val="char11"/>
+          <w:rFonts w:eastAsia="Roboto Condensed ExtraLight" w:cs="Roboto Condensed ExtraLight"/>
         </w:rPr>
         <w:t xml:space="preserve"> Elseware.Startup </w:t>
       </w:r>
@@ -9947,12 +10017,14 @@
       <w:r>
         <w:rPr>
           <w:rStyle w:val="char11"/>
+          <w:rFonts w:eastAsia="Roboto Condensed ExtraLight" w:cs="Roboto Condensed ExtraLight"/>
         </w:rPr>
         <w:t xml:space="preserve"> Progra</w:t>
       </w:r>
       <w:r>
         <w:rPr>
           <w:rStyle w:val="char11"/>
+          <w:rFonts w:eastAsia="Roboto Condensed ExtraLight" w:cs="Roboto Condensed ExtraLight"/>
         </w:rPr>
         <w:t xml:space="preserve">m </w:t>
       </w:r>
@@ -10289,12 +10361,14 @@
       <w:r>
         <w:rPr>
           <w:rStyle w:val="char11"/>
+          <w:rFonts w:eastAsia="Roboto Condensed ExtraLight" w:cs="Roboto Condensed ExtraLight"/>
         </w:rPr>
         <w:t xml:space="preserve"> heade</w:t>
       </w:r>
       <w:r>
         <w:rPr>
           <w:rStyle w:val="char11"/>
+          <w:rFonts w:eastAsia="Roboto Condensed ExtraLight" w:cs="Roboto Condensed ExtraLight"/>
         </w:rPr>
         <w:t xml:space="preserve">r </w:t>
       </w:r>
@@ -10326,6 +10400,7 @@
       <w:r>
         <w:rPr>
           <w:rStyle w:val="char11"/>
+          <w:rFonts w:eastAsia="Roboto Condensed ExtraLight" w:cs="Roboto Condensed ExtraLight"/>
         </w:rPr>
         <w:t xml:space="preserve"> Program </w:t>
       </w:r>
@@ -10335,6 +10410,7 @@
       <w:r>
         <w:rPr>
           <w:rStyle w:val="char11"/>
+          <w:rFonts w:eastAsia="Roboto Condensed ExtraLight" w:cs="Roboto Condensed ExtraLight"/>
         </w:rPr>
         <w:t xml:space="preserve"> Main </w:t>
       </w:r>
@@ -10599,6 +10675,7 @@
       <w:r>
         <w:rPr>
           <w:rStyle w:val="char11"/>
+          <w:rFonts w:eastAsia="Roboto Condensed ExtraLight" w:cs="Roboto Condensed ExtraLight"/>
         </w:rPr>
         <w:t xml:space="preserve"> Program </w:t>
       </w:r>
@@ -10608,6 +10685,7 @@
       <w:r>
         <w:rPr>
           <w:rStyle w:val="char11"/>
+          <w:rFonts w:eastAsia="Roboto Condensed ExtraLight" w:cs="Roboto Condensed ExtraLight"/>
         </w:rPr>
         <w:t xml:space="preserve"> Main </w:t>
       </w:r>
@@ -10824,6 +10902,7 @@
       <w:r>
         <w:rPr>
           <w:rStyle w:val="char11"/>
+          <w:rFonts w:eastAsia="Roboto Condensed ExtraLight" w:cs="Roboto Condensed ExtraLight"/>
         </w:rPr>
         <w:t xml:space="preserve"> Main </w:t>
       </w:r>
@@ -11347,6 +11426,7 @@
       <w:r>
         <w:rPr>
           <w:rStyle w:val="char11"/>
+          <w:rFonts w:eastAsia="Roboto Condensed ExtraLight" w:cs="Roboto Condensed ExtraLight"/>
         </w:rPr>
         <w:t xml:space="preserve"> Main </w:t>
       </w:r>
@@ -11759,6 +11839,7 @@
       <w:r>
         <w:rPr>
           <w:rStyle w:val="char11"/>
+          <w:rFonts w:eastAsia="Roboto Condensed ExtraLight" w:cs="Roboto Condensed ExtraLight"/>
         </w:rPr>
         <w:t xml:space="preserve"> int </w:t>
       </w:r>
@@ -11768,6 +11849,7 @@
       <w:r>
         <w:rPr>
           <w:rStyle w:val="char11"/>
+          <w:rFonts w:eastAsia="Roboto Condensed ExtraLight" w:cs="Roboto Condensed ExtraLight"/>
         </w:rPr>
         <w:t xml:space="preserve"> string </w:t>
       </w:r>
@@ -11777,6 +11859,7 @@
       <w:r>
         <w:rPr>
           <w:rStyle w:val="char11"/>
+          <w:rFonts w:eastAsia="Roboto Condensed ExtraLight" w:cs="Roboto Condensed ExtraLight"/>
         </w:rPr>
         <w:t xml:space="preserve"> bool </w:t>
       </w:r>
@@ -12450,6 +12533,7 @@
       <w:r>
         <w:rPr>
           <w:rStyle w:val="char11"/>
+          <w:rFonts w:eastAsia="Roboto Condensed ExtraLight" w:cs="Roboto Condensed ExtraLight"/>
         </w:rPr>
         <w:t xml:space="preserve"> Main </w:t>
       </w:r>
@@ -12459,6 +12543,7 @@
       <w:r>
         <w:rPr>
           <w:rStyle w:val="char11"/>
+          <w:rFonts w:eastAsia="Roboto Condensed ExtraLight" w:cs="Roboto Condensed ExtraLight"/>
         </w:rPr>
         <w:t xml:space="preserve"> Program </w:t>
       </w:r>
@@ -13226,6 +13311,7 @@
       <w:r>
         <w:rPr>
           <w:rStyle w:val="char11"/>
+          <w:rFonts w:eastAsia="Roboto Condensed ExtraLight" w:cs="Roboto Condensed ExtraLight"/>
         </w:rPr>
         <w:t xml:space="preserve"> AllowAnyOrigin </w:t>
       </w:r>
@@ -14789,6 +14875,7 @@
       <w:r>
         <w:rPr>
           <w:rStyle w:val="char11"/>
+          <w:rFonts w:eastAsia="Roboto Condensed ExtraLight" w:cs="Roboto Condensed ExtraLight"/>
         </w:rPr>
         <w:t xml:space="preserve"> ERR_INVALID_REDIRECT </w:t>
       </w:r>
@@ -14825,6 +14912,7 @@
       <w:r>
         <w:rPr>
           <w:rStyle w:val="char11"/>
+          <w:rFonts w:eastAsia="Roboto Condensed ExtraLight" w:cs="Roboto Condensed ExtraLight"/>
         </w:rPr>
         <w:t xml:space="preserve"> Main </w:t>
       </w:r>
@@ -14834,6 +14922,7 @@
       <w:r>
         <w:rPr>
           <w:rStyle w:val="char11"/>
+          <w:rFonts w:eastAsia="Roboto Condensed ExtraLight" w:cs="Roboto Condensed ExtraLight"/>
         </w:rPr>
         <w:t xml:space="preserve"> Program </w:t>
       </w:r>
@@ -14843,6 +14932,7 @@
       <w:r>
         <w:rPr>
           <w:rStyle w:val="char11"/>
+          <w:rFonts w:eastAsia="Roboto Condensed ExtraLight" w:cs="Roboto Condensed ExtraLight"/>
         </w:rPr>
         <w:t xml:space="preserve"> UseHttpsRedirection </w:t>
       </w:r>
@@ -15015,6 +15105,7 @@
       <w:r>
         <w:rPr>
           <w:rStyle w:val="char11"/>
+          <w:rFonts w:eastAsia="Roboto Condensed ExtraLight" w:cs="Roboto Condensed ExtraLight"/>
         </w:rPr>
         <w:t xml:space="preserve"> 400 </w:t>
       </w:r>
@@ -15024,6 +15115,7 @@
       <w:r>
         <w:rPr>
           <w:rStyle w:val="char11"/>
+          <w:rFonts w:eastAsia="Roboto Condensed ExtraLight" w:cs="Roboto Condensed ExtraLight"/>
         </w:rPr>
         <w:t xml:space="preserve"> bad request </w:t>
       </w:r>
@@ -15365,7 +15457,7 @@
               <w:tl2br w:val="nil" w:sz="0" w:space="0" w:color="000000" tmln="20, 20, 20, 0, 0"/>
               <w:tr2bl w:val="nil" w:sz="0" w:space="0" w:color="000000" tmln="20, 20, 20, 0, 0"/>
             </w:tcBorders>
-            <w:tmTcPr id="1756511447" protected="0"/>
+            <w:tmTcPr id="1756720597" protected="0"/>
           </w:tcPr>
           <w:p>
             <w:pPr>
@@ -15411,7 +15503,7 @@
               <w:tl2br w:val="nil" w:sz="0" w:space="0" w:color="000000" tmln="20, 20, 20, 0, 0"/>
               <w:tr2bl w:val="nil" w:sz="0" w:space="0" w:color="000000" tmln="20, 20, 20, 0, 0"/>
             </w:tcBorders>
-            <w:tmTcPr id="1756511447" protected="0"/>
+            <w:tmTcPr id="1756720597" protected="0"/>
           </w:tcPr>
           <w:p>
             <w:pPr>
@@ -15464,7 +15556,7 @@
               <w:tl2br w:val="nil" w:sz="0" w:space="0" w:color="000000" tmln="20, 20, 20, 0, 0"/>
               <w:tr2bl w:val="nil" w:sz="0" w:space="0" w:color="000000" tmln="20, 20, 20, 0, 0"/>
             </w:tcBorders>
-            <w:tmTcPr id="1756511447" protected="0"/>
+            <w:tmTcPr id="1756720597" protected="0"/>
           </w:tcPr>
           <w:p>
             <w:pPr>
@@ -15503,7 +15595,7 @@
               <w:tl2br w:val="nil" w:sz="0" w:space="0" w:color="000000" tmln="20, 20, 20, 0, 0"/>
               <w:tr2bl w:val="nil" w:sz="0" w:space="0" w:color="000000" tmln="20, 20, 20, 0, 0"/>
             </w:tcBorders>
-            <w:tmTcPr id="1756511447" protected="0"/>
+            <w:tmTcPr id="1756720597" protected="0"/>
           </w:tcPr>
           <w:p>
             <w:pPr>
@@ -15539,7 +15631,7 @@
               <w:tl2br w:val="nil" w:sz="0" w:space="0" w:color="000000" tmln="20, 20, 20, 0, 0"/>
               <w:tr2bl w:val="nil" w:sz="0" w:space="0" w:color="000000" tmln="20, 20, 20, 0, 0"/>
             </w:tcBorders>
-            <w:tmTcPr id="1756511447" protected="0"/>
+            <w:tmTcPr id="1756720597" protected="0"/>
           </w:tcPr>
           <w:p>
             <w:pPr>
@@ -15568,7 +15660,7 @@
               <w:tl2br w:val="nil" w:sz="0" w:space="0" w:color="000000" tmln="20, 20, 20, 0, 0"/>
               <w:tr2bl w:val="nil" w:sz="0" w:space="0" w:color="000000" tmln="20, 20, 20, 0, 0"/>
             </w:tcBorders>
-            <w:tmTcPr id="1756511447" protected="0"/>
+            <w:tmTcPr id="1756720597" protected="0"/>
           </w:tcPr>
           <w:p>
             <w:pPr>
@@ -15604,7 +15696,7 @@
               <w:tl2br w:val="nil" w:sz="0" w:space="0" w:color="000000" tmln="20, 20, 20, 0, 0"/>
               <w:tr2bl w:val="nil" w:sz="0" w:space="0" w:color="000000" tmln="20, 20, 20, 0, 0"/>
             </w:tcBorders>
-            <w:tmTcPr id="1756511447" protected="0"/>
+            <w:tmTcPr id="1756720597" protected="0"/>
           </w:tcPr>
           <w:p>
             <w:pPr>
@@ -15633,7 +15725,7 @@
               <w:tl2br w:val="nil" w:sz="0" w:space="0" w:color="000000" tmln="20, 20, 20, 0, 0"/>
               <w:tr2bl w:val="nil" w:sz="0" w:space="0" w:color="000000" tmln="20, 20, 20, 0, 0"/>
             </w:tcBorders>
-            <w:tmTcPr id="1756511447" protected="0"/>
+            <w:tmTcPr id="1756720597" protected="0"/>
           </w:tcPr>
           <w:p>
             <w:pPr>
@@ -15669,7 +15761,7 @@
               <w:tl2br w:val="nil" w:sz="0" w:space="0" w:color="000000" tmln="20, 20, 20, 0, 0"/>
               <w:tr2bl w:val="nil" w:sz="0" w:space="0" w:color="000000" tmln="20, 20, 20, 0, 0"/>
             </w:tcBorders>
-            <w:tmTcPr id="1756511447" protected="0"/>
+            <w:tmTcPr id="1756720597" protected="0"/>
           </w:tcPr>
           <w:p>
             <w:pPr>
@@ -15698,7 +15790,7 @@
               <w:tl2br w:val="nil" w:sz="0" w:space="0" w:color="000000" tmln="20, 20, 20, 0, 0"/>
               <w:tr2bl w:val="nil" w:sz="0" w:space="0" w:color="000000" tmln="20, 20, 20, 0, 0"/>
             </w:tcBorders>
-            <w:tmTcPr id="1756511447" protected="0"/>
+            <w:tmTcPr id="1756720597" protected="0"/>
           </w:tcPr>
           <w:p>
             <w:pPr>
@@ -15734,7 +15826,7 @@
               <w:tl2br w:val="nil" w:sz="0" w:space="0" w:color="000000" tmln="20, 20, 20, 0, 0"/>
               <w:tr2bl w:val="nil" w:sz="0" w:space="0" w:color="000000" tmln="20, 20, 20, 0, 0"/>
             </w:tcBorders>
-            <w:tmTcPr id="1756511447" protected="0"/>
+            <w:tmTcPr id="1756720597" protected="0"/>
           </w:tcPr>
           <w:p>
             <w:pPr>
@@ -15763,7 +15855,7 @@
               <w:tl2br w:val="nil" w:sz="0" w:space="0" w:color="000000" tmln="20, 20, 20, 0, 0"/>
               <w:tr2bl w:val="nil" w:sz="0" w:space="0" w:color="000000" tmln="20, 20, 20, 0, 0"/>
             </w:tcBorders>
-            <w:tmTcPr id="1756511447" protected="0"/>
+            <w:tmTcPr id="1756720597" protected="0"/>
           </w:tcPr>
           <w:p>
             <w:pPr>
@@ -15799,7 +15891,7 @@
               <w:tl2br w:val="nil" w:sz="0" w:space="0" w:color="000000" tmln="20, 20, 20, 0, 0"/>
               <w:tr2bl w:val="nil" w:sz="0" w:space="0" w:color="000000" tmln="20, 20, 20, 0, 0"/>
             </w:tcBorders>
-            <w:tmTcPr id="1756511447" protected="0"/>
+            <w:tmTcPr id="1756720597" protected="0"/>
           </w:tcPr>
           <w:p>
             <w:pPr>
@@ -15828,7 +15920,7 @@
               <w:tl2br w:val="nil" w:sz="0" w:space="0" w:color="000000" tmln="20, 20, 20, 0, 0"/>
               <w:tr2bl w:val="nil" w:sz="0" w:space="0" w:color="000000" tmln="20, 20, 20, 0, 0"/>
             </w:tcBorders>
-            <w:tmTcPr id="1756511447" protected="0"/>
+            <w:tmTcPr id="1756720597" protected="0"/>
           </w:tcPr>
           <w:p>
             <w:pPr>
@@ -16444,6 +16536,7 @@
       <w:r>
         <w:rPr>
           <w:rStyle w:val="char11"/>
+          <w:rFonts w:eastAsia="Roboto Condensed ExtraLight" w:cs="Roboto Condensed ExtraLight"/>
         </w:rPr>
         <w:t xml:space="preserve"> Main </w:t>
       </w:r>
@@ -16453,6 +16546,7 @@
       <w:r>
         <w:rPr>
           <w:rStyle w:val="char11"/>
+          <w:rFonts w:eastAsia="Roboto Condensed ExtraLight" w:cs="Roboto Condensed ExtraLight"/>
         </w:rPr>
         <w:t xml:space="preserve"> Program </w:t>
       </w:r>
@@ -16669,6 +16763,7 @@
       <w:r>
         <w:rPr>
           <w:rStyle w:val="char11"/>
+          <w:rFonts w:eastAsia="Roboto Condensed ExtraLight" w:cs="Roboto Condensed ExtraLight"/>
         </w:rPr>
         <w:t xml:space="preserve"> Main </w:t>
       </w:r>
@@ -16678,6 +16773,7 @@
       <w:r>
         <w:rPr>
           <w:rStyle w:val="char11"/>
+          <w:rFonts w:eastAsia="Roboto Condensed ExtraLight" w:cs="Roboto Condensed ExtraLight"/>
         </w:rPr>
         <w:t xml:space="preserve"> Program </w:t>
       </w:r>
@@ -16687,6 +16783,7 @@
       <w:r>
         <w:rPr>
           <w:rStyle w:val="char11"/>
+          <w:rFonts w:eastAsia="Roboto Condensed ExtraLight" w:cs="Roboto Condensed ExtraLight"/>
         </w:rPr>
         <w:t xml:space="preserve"> Elseware.Middlewares </w:t>
       </w:r>
@@ -17441,6 +17538,7 @@
       <w:r>
         <w:rPr>
           <w:rStyle w:val="char11"/>
+          <w:rFonts w:eastAsia="Roboto Condensed ExtraLight" w:cs="Roboto Condensed ExtraLight"/>
         </w:rPr>
         <w:t xml:space="preserve"> Main </w:t>
       </w:r>
@@ -17450,6 +17548,7 @@
       <w:r>
         <w:rPr>
           <w:rStyle w:val="char11"/>
+          <w:rFonts w:eastAsia="Roboto Condensed ExtraLight" w:cs="Roboto Condensed ExtraLight"/>
         </w:rPr>
         <w:t xml:space="preserve"> Program </w:t>
       </w:r>
@@ -17459,6 +17558,7 @@
       <w:r>
         <w:rPr>
           <w:rStyle w:val="char11"/>
+          <w:rFonts w:eastAsia="Roboto Condensed ExtraLight" w:cs="Roboto Condensed ExtraLight"/>
         </w:rPr>
         <w:t xml:space="preserve"> WebApplicationBuilder </w:t>
       </w:r>
@@ -18113,6 +18213,7 @@
       <w:r>
         <w:rPr>
           <w:rStyle w:val="char11"/>
+          <w:rFonts w:eastAsia="Roboto Condensed ExtraLight" w:cs="Roboto Condensed ExtraLight"/>
         </w:rPr>
         <w:t xml:space="preserve"> ConfigureCors </w:t>
       </w:r>
@@ -18122,6 +18223,7 @@
       <w:r>
         <w:rPr>
           <w:rStyle w:val="char11"/>
+          <w:rFonts w:eastAsia="Roboto Condensed ExtraLight" w:cs="Roboto Condensed ExtraLight"/>
         </w:rPr>
         <w:t xml:space="preserve"> Main </w:t>
       </w:r>
@@ -18131,6 +18233,7 @@
       <w:r>
         <w:rPr>
           <w:rStyle w:val="char11"/>
+          <w:rFonts w:eastAsia="Roboto Condensed ExtraLight" w:cs="Roboto Condensed ExtraLight"/>
         </w:rPr>
         <w:t xml:space="preserve"> Program </w:t>
       </w:r>
@@ -18762,6 +18865,7 @@
       <w:r>
         <w:rPr>
           <w:rStyle w:val="char11"/>
+          <w:rFonts w:eastAsia="Roboto Condensed ExtraLight" w:cs="Roboto Condensed ExtraLight"/>
         </w:rPr>
         <w:t xml:space="preserve"> dotnet run </w:t>
       </w:r>
@@ -18778,16 +18882,17 @@
         </w:numPr>
         <w:ind w:left="454" w:hanging="360"/>
         <w:rPr>
-          <w:rFonts w:ascii="Roboto Serif 28pt Thin" w:hAnsi="Roboto Serif 28pt Thin"/>
           <w:i/>
         </w:rPr>
       </w:pPr>
       <w:r>
+        <w:rPr>
+          <w:rFonts w:ascii="Roboto Condensed ExtraLight" w:hAnsi="Roboto Condensed ExtraLight"/>
+        </w:rPr>
         <w:t>Development</w:t>
       </w:r>
       <w:r>
         <w:rPr>
-          <w:rFonts w:ascii="Roboto Serif 28pt Thin" w:hAnsi="Roboto Serif 28pt Thin"/>
           <w:i/>
         </w:rPr>
       </w:r>
@@ -18801,16 +18906,17 @@
         </w:numPr>
         <w:ind w:left="454" w:hanging="360"/>
         <w:rPr>
-          <w:rFonts w:ascii="Roboto Serif 28pt Thin" w:hAnsi="Roboto Serif 28pt Thin"/>
           <w:i/>
         </w:rPr>
       </w:pPr>
       <w:r>
+        <w:rPr>
+          <w:rFonts w:ascii="Roboto Condensed ExtraLight" w:hAnsi="Roboto Condensed ExtraLight"/>
+        </w:rPr>
         <w:t>Staging</w:t>
       </w:r>
       <w:r>
         <w:rPr>
-          <w:rFonts w:ascii="Roboto Serif 28pt Thin" w:hAnsi="Roboto Serif 28pt Thin"/>
           <w:i/>
         </w:rPr>
       </w:r>
@@ -18824,16 +18930,17 @@
         </w:numPr>
         <w:ind w:left="454" w:hanging="360"/>
         <w:rPr>
-          <w:rFonts w:ascii="Roboto Serif 28pt Thin" w:hAnsi="Roboto Serif 28pt Thin"/>
           <w:i/>
         </w:rPr>
       </w:pPr>
       <w:r>
+        <w:rPr>
+          <w:rFonts w:ascii="Roboto Condensed ExtraLight" w:hAnsi="Roboto Condensed ExtraLight"/>
+        </w:rPr>
         <w:t>Production</w:t>
       </w:r>
       <w:r>
         <w:rPr>
-          <w:rFonts w:ascii="Roboto Serif 28pt Thin" w:hAnsi="Roboto Serif 28pt Thin"/>
           <w:i/>
         </w:rPr>
       </w:r>
@@ -19499,6 +19606,7 @@
       <w:r>
         <w:rPr>
           <w:rStyle w:val="char11"/>
+          <w:rFonts w:eastAsia="Roboto Condensed ExtraLight" w:cs="Roboto Condensed ExtraLight"/>
         </w:rPr>
         <w:t xml:space="preserve"> main </w:t>
       </w:r>
@@ -19567,7 +19675,7 @@
                       <a:picLocks noChangeAspect="1"/>
                       <a:extLst>
                         <a:ext uri="sm">
-                          <sm:smNativeData xmlns:sm="sm" val="SMDATA_17_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"/>
+                          <sm:smNativeData xmlns:sm="sm" val="SMDATA_17_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"/>
                         </a:ext>
                       </a:extLst>
                     </pic:cNvPicPr>
@@ -19619,6 +19727,7 @@
       <w:r>
         <w:rPr>
           <w:rStyle w:val="char11"/>
+          <w:rFonts w:eastAsia="Roboto Condensed ExtraLight" w:cs="Roboto Condensed ExtraLight"/>
         </w:rPr>
         <w:t xml:space="preserve"> origin-main </w:t>
       </w:r>
@@ -19970,7 +20079,7 @@
                       <a:picLocks noChangeAspect="1"/>
                       <a:extLst>
                         <a:ext uri="sm">
-                          <sm:smNativeData xmlns:sm="sm" val="SMDATA_17_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"/>
+                          <sm:smNativeData xmlns:sm="sm" val="SMDATA_17_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"/>
                         </a:ext>
                       </a:extLst>
                     </pic:cNvPicPr>
@@ -20157,7 +20266,7 @@
                       <a:picLocks noChangeAspect="1"/>
                       <a:extLst>
                         <a:ext uri="sm">
-                          <sm:smNativeData xmlns:sm="sm" val="SMDATA_17_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"/>
+                          <sm:smNativeData xmlns:sm="sm" val="SMDATA_17_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"/>
                         </a:ext>
                       </a:extLst>
                     </pic:cNvPicPr>
@@ -20257,7 +20366,7 @@
                       <a:picLocks noChangeAspect="1"/>
                       <a:extLst>
                         <a:ext uri="sm">
-                          <sm:smNativeData xmlns:sm="sm" val="SMDATA_17_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"/>
+                          <sm:smNativeData xmlns:sm="sm" val="SMDATA_17_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"/>
                         </a:ext>
                       </a:extLst>
                     </pic:cNvPicPr>
@@ -20326,7 +20435,7 @@
                       <a:picLocks noChangeAspect="1"/>
                       <a:extLst>
                         <a:ext uri="sm">
-                          <sm:smNativeData xmlns:sm="sm" val="SMDATA_17_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"/>
+                          <sm:smNativeData xmlns:sm="sm" val="SMDATA_17_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"/>
                         </a:ext>
                       </a:extLst>
                     </pic:cNvPicPr>
@@ -20387,7 +20496,7 @@
                       <a:picLocks noChangeAspect="1"/>
                       <a:extLst>
                         <a:ext uri="sm">
-                          <sm:smNativeData xmlns:sm="sm" val="SMDATA_17_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"/>
+                          <sm:smNativeData xmlns:sm="sm" val="SMDATA_17_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"/>
                         </a:ext>
                       </a:extLst>
                     </pic:cNvPicPr>
@@ -20441,7 +20550,7 @@
                       <a:picLocks noChangeAspect="1"/>
                       <a:extLst>
                         <a:ext uri="sm">
-                          <sm:smNativeData xmlns:sm="sm" val="SMDATA_17_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"/>
+                          <sm:smNativeData xmlns:sm="sm" val="SMDATA_17_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"/>
                         </a:ext>
                       </a:extLst>
                     </pic:cNvPicPr>
@@ -20495,7 +20604,7 @@
                       <a:picLocks noChangeAspect="1"/>
                       <a:extLst>
                         <a:ext uri="sm">
-                          <sm:smNativeData xmlns:sm="sm" val="SMDATA_17_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"/>
+                          <sm:smNativeData xmlns:sm="sm" val="SMDATA_17_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"/>
                         </a:ext>
                       </a:extLst>
                     </pic:cNvPicPr>
@@ -20616,6 +20725,7 @@
       <w:r>
         <w:rPr>
           <w:rStyle w:val="char11"/>
+          <w:rFonts w:eastAsia="Roboto Condensed ExtraLight" w:cs="Roboto Condensed ExtraLight"/>
         </w:rPr>
         <w:t xml:space="preserve"> Main </w:t>
       </w:r>
@@ -20625,6 +20735,7 @@
       <w:r>
         <w:rPr>
           <w:rStyle w:val="char11"/>
+          <w:rFonts w:eastAsia="Roboto Condensed ExtraLight" w:cs="Roboto Condensed ExtraLight"/>
         </w:rPr>
         <w:t xml:space="preserve"> Program </w:t>
       </w:r>
@@ -20825,6 +20936,9 @@
         <w:t xml:space="preserve"> o strumenti simili) devono </w:t>
       </w:r>
       <w:r>
+        <w:rPr>
+          <w:rFonts w:cs="Roboto Condensed ExtraLight"/>
+        </w:rPr>
         <w:t xml:space="preserve">essere limitate esclusivamente alla configurazione di sviluppo </w:t>
       </w:r>
       <w:r>
@@ -20921,6 +21035,9 @@
         <w:t xml:space="preserve">Esporre la documentazione in ambiente di produzione potrebbe rivelare dettagli sensibili sugli </w:t>
       </w:r>
       <w:r>
+        <w:rPr>
+          <w:rFonts w:cs="Roboto Condensed ExtraLight"/>
+        </w:rPr>
         <w:t>endpoint</w:t>
       </w:r>
       <w:r>
@@ -20990,6 +21107,9 @@
         <w:t xml:space="preserve">In produzione, gli utenti finali o i </w:t>
       </w:r>
       <w:r>
+        <w:rPr>
+          <w:rFonts w:cs="Roboto Condensed ExtraLight"/>
+        </w:rPr>
         <w:t>client</w:t>
       </w:r>
       <w:r>
@@ -21073,6 +21193,9 @@
         <w:t xml:space="preserve"> ed il relativo visualizzatore introducono componenti aggiuntivi nella </w:t>
       </w:r>
       <w:r>
+        <w:rPr>
+          <w:rFonts w:cs="Roboto Condensed ExtraLight"/>
+        </w:rPr>
         <w:t>pipeline</w:t>
       </w:r>
       <w:r>
@@ -21098,6 +21221,9 @@
         <w:t xml:space="preserve">. In ambiente </w:t>
       </w:r>
       <w:r>
+        <w:rPr>
+          <w:rFonts w:cs="Roboto Condensed ExtraLight"/>
+        </w:rPr>
         <w:t>live</w:t>
       </w:r>
       <w:r>
@@ -21109,6 +21235,9 @@
         <w:t xml:space="preserve">, si dovrebbe evitare il caricamento di caratteristiche non essenziali per ridurre </w:t>
       </w:r>
       <w:r>
+        <w:rPr>
+          <w:rFonts w:cs="Roboto Condensed ExtraLight"/>
+        </w:rPr>
         <w:t>overhead</w:t>
       </w:r>
       <w:r>
@@ -21177,6 +21306,7 @@
       <w:r>
         <w:rPr>
           <w:rStyle w:val="char11"/>
+          <w:rFonts w:eastAsia="Roboto Condensed ExtraLight" w:cs="Roboto Condensed ExtraLight"/>
         </w:rPr>
         <w:t xml:space="preserve"> Scalar.AspNetCore </w:t>
       </w:r>
@@ -21246,7 +21376,7 @@
                       <a:picLocks noChangeAspect="1"/>
                       <a:extLst>
                         <a:ext uri="sm">
-                          <sm:smNativeData xmlns:sm="sm" val="SMDATA_17_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"/>
+                          <sm:smNativeData xmlns:sm="sm" val="SMDATA_17_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"/>
                         </a:ext>
                       </a:extLst>
                     </pic:cNvPicPr>
@@ -21326,6 +21456,7 @@
       <w:r>
         <w:rPr>
           <w:rStyle w:val="char11"/>
+          <w:rFonts w:eastAsia="Roboto Condensed ExtraLight" w:cs="Roboto Condensed ExtraLight"/>
         </w:rPr>
         <w:t xml:space="preserve"> Main </w:t>
       </w:r>
@@ -21335,6 +21466,7 @@
       <w:r>
         <w:rPr>
           <w:rStyle w:val="char11"/>
+          <w:rFonts w:eastAsia="Roboto Condensed ExtraLight" w:cs="Roboto Condensed ExtraLight"/>
         </w:rPr>
         <w:t xml:space="preserve"> Program </w:t>
       </w:r>
@@ -21432,6 +21564,7 @@
       <w:r>
         <w:rPr>
           <w:rStyle w:val="char11"/>
+          <w:rFonts w:eastAsia="Roboto Condensed ExtraLight" w:cs="Roboto Condensed ExtraLight"/>
         </w:rPr>
         <w:t xml:space="preserve"> MapScalarApiReference </w:t>
       </w:r>
@@ -21441,6 +21574,7 @@
       <w:r>
         <w:rPr>
           <w:rStyle w:val="char11"/>
+          <w:rFonts w:eastAsia="Roboto Condensed ExtraLight" w:cs="Roboto Condensed ExtraLight"/>
         </w:rPr>
         <w:t xml:space="preserve"> Program </w:t>
       </w:r>
@@ -21450,6 +21584,7 @@
       <w:r>
         <w:rPr>
           <w:rStyle w:val="char11"/>
+          <w:rFonts w:eastAsia="Roboto Condensed ExtraLight" w:cs="Roboto Condensed ExtraLight"/>
         </w:rPr>
         <w:t xml:space="preserve"> Scalar.AspNetCore </w:t>
       </w:r>
@@ -22433,7 +22568,7 @@
                       <a:picLocks noChangeAspect="1"/>
                       <a:extLst>
                         <a:ext uri="sm">
-                          <sm:smNativeData xmlns:sm="sm" val="SMDATA_17_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"/>
+                          <sm:smNativeData xmlns:sm="sm" val="SMDATA_17_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"/>
                         </a:ext>
                       </a:extLst>
                     </pic:cNvPicPr>
@@ -22561,6 +22696,7 @@
       <w:r>
         <w:rPr>
           <w:rStyle w:val="char11"/>
+          <w:rFonts w:eastAsia="Roboto Condensed ExtraLight" w:cs="Roboto Condensed ExtraLight"/>
         </w:rPr>
         <w:t xml:space="preserve"> [HttpGet] </w:t>
       </w:r>
@@ -22570,6 +22706,7 @@
       <w:r>
         <w:rPr>
           <w:rStyle w:val="char11"/>
+          <w:rFonts w:eastAsia="Roboto Condensed ExtraLight" w:cs="Roboto Condensed ExtraLight"/>
         </w:rPr>
         <w:t xml:space="preserve"> [HttpPost] </w:t>
       </w:r>
@@ -22579,6 +22716,7 @@
       <w:r>
         <w:rPr>
           <w:rStyle w:val="char11"/>
+          <w:rFonts w:eastAsia="Roboto Condensed ExtraLight" w:cs="Roboto Condensed ExtraLight"/>
         </w:rPr>
         <w:t xml:space="preserve"> [FromBody] </w:t>
       </w:r>
@@ -22588,6 +22726,7 @@
       <w:r>
         <w:rPr>
           <w:rStyle w:val="char11"/>
+          <w:rFonts w:eastAsia="Roboto Condensed ExtraLight" w:cs="Roboto Condensed ExtraLight"/>
         </w:rPr>
         <w:t xml:space="preserve"> [Produces] </w:t>
       </w:r>
@@ -22628,6 +22767,7 @@
       <w:r>
         <w:rPr>
           <w:rStyle w:val="char11"/>
+          <w:rFonts w:eastAsia="Roboto Condensed ExtraLight" w:cs="Roboto Condensed ExtraLight"/>
         </w:rPr>
         <w:t> WeatherForecast </w:t>
       </w:r>
@@ -22764,7 +22904,7 @@
                       <a:picLocks noChangeAspect="1"/>
                       <a:extLst>
                         <a:ext uri="sm">
-                          <sm:smNativeData xmlns:sm="sm" val="SMDATA_17_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"/>
+                          <sm:smNativeData xmlns:sm="sm" val="SMDATA_17_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"/>
                         </a:ext>
                       </a:extLst>
                     </pic:cNvPicPr>
@@ -22883,7 +23023,7 @@
                       <a:picLocks noChangeAspect="1"/>
                       <a:extLst>
                         <a:ext uri="sm">
-                          <sm:smNativeData xmlns:sm="sm" val="SMDATA_17_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"/>
+                          <sm:smNativeData xmlns:sm="sm" val="SMDATA_17_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"/>
                         </a:ext>
                       </a:extLst>
                     </pic:cNvPicPr>
@@ -23090,7 +23230,7 @@
                       <a:picLocks noChangeAspect="1"/>
                       <a:extLst>
                         <a:ext uri="sm">
-                          <sm:smNativeData xmlns:sm="sm" val="SMDATA_17_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"/>
+                          <sm:smNativeData xmlns:sm="sm" val="SMDATA_17_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"/>
                         </a:ext>
                       </a:extLst>
                     </pic:cNvPicPr>
@@ -23177,7 +23317,7 @@
                       <a:picLocks noChangeAspect="1"/>
                       <a:extLst>
                         <a:ext uri="sm">
-                          <sm:smNativeData xmlns:sm="sm" val="SMDATA_17_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"/>
+                          <sm:smNativeData xmlns:sm="sm" val="SMDATA_17_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"/>
                         </a:ext>
                       </a:extLst>
                     </pic:cNvPicPr>
@@ -24263,6 +24403,7 @@
       <w:r>
         <w:rPr>
           <w:rStyle w:val="char11"/>
+          <w:rFonts w:eastAsia="Roboto Condensed ExtraLight" w:cs="Roboto Condensed ExtraLight"/>
         </w:rPr>
         <w:t> DataStoreFactory </w:t>
       </w:r>
@@ -24272,6 +24413,7 @@
       <w:r>
         <w:rPr>
           <w:rStyle w:val="char11"/>
+          <w:rFonts w:eastAsia="Roboto Condensed ExtraLight" w:cs="Roboto Condensed ExtraLight"/>
         </w:rPr>
         <w:t> IDesignTimeDbContextFactory&lt;DataStore&gt; </w:t>
       </w:r>
@@ -24286,6 +24428,7 @@
       <w:r>
         <w:rPr>
           <w:rStyle w:val="char11"/>
+          <w:rFonts w:eastAsia="Roboto Condensed ExtraLight" w:cs="Roboto Condensed ExtraLight"/>
         </w:rPr>
         <w:t xml:space="preserve"> // &lt;auto-generated&gt; </w:t>
       </w:r>
@@ -24295,6 +24438,7 @@
       <w:r>
         <w:rPr>
           <w:rStyle w:val="char11"/>
+          <w:rFonts w:eastAsia="Roboto Condensed ExtraLight" w:cs="Roboto Condensed ExtraLight"/>
         </w:rPr>
         <w:t xml:space="preserve"> // &lt;auto-generated&gt; </w:t>
       </w:r>
@@ -24309,6 +24453,7 @@
       <w:r>
         <w:rPr>
           <w:rStyle w:val="char11"/>
+          <w:rFonts w:eastAsia="Roboto Condensed ExtraLight" w:cs="Roboto Condensed ExtraLight"/>
         </w:rPr>
         <w:t xml:space="preserve"> // &lt;auto-generated&gt; </w:t>
       </w:r>
@@ -24318,6 +24463,7 @@
       <w:r>
         <w:rPr>
           <w:rStyle w:val="char11"/>
+          <w:rFonts w:eastAsia="Roboto Condensed ExtraLight" w:cs="Roboto Condensed ExtraLight"/>
         </w:rPr>
         <w:t> CSharpMigrationsGenerator </w:t>
       </w:r>
@@ -24335,6 +24481,7 @@
       <w:r>
         <w:rPr>
           <w:rStyle w:val="char11"/>
+          <w:rFonts w:eastAsia="Roboto Condensed ExtraLight" w:cs="Roboto Condensed ExtraLight"/>
         </w:rPr>
         <w:t> Microsoft.EntityFrameworkCore.Design </w:t>
       </w:r>
@@ -24383,7 +24530,7 @@
                       <a:picLocks noChangeAspect="1"/>
                       <a:extLst>
                         <a:ext uri="sm">
-                          <sm:smNativeData xmlns:sm="sm" val="SMDATA_17_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"/>
+                          <sm:smNativeData xmlns:sm="sm" val="SMDATA_17_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"/>
                         </a:ext>
                       </a:extLst>
                     </pic:cNvPicPr>
@@ -24438,6 +24585,11 @@
         </w:rPr>
         <w:t>dotnet ef migrations add 001_CreateDatabase --output-dir Infrastructure/Persistence/Migrations</w:t>
       </w:r>
+      <w:r>
+        <w:rPr>
+          <w:rFonts w:ascii="Roboto Mono" w:hAnsi="Roboto Mono"/>
+        </w:rPr>
+      </w:r>
     </w:p>
     <w:p>
       <w:r>
@@ -24461,7 +24613,7 @@
                       <a:picLocks noChangeAspect="1"/>
                       <a:extLst>
                         <a:ext uri="sm">
-                          <sm:smNativeData xmlns:sm="sm" val="SMDATA_17_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"/>
+                          <sm:smNativeData xmlns:sm="sm" val="SMDATA_17_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"/>
                         </a:ext>
                       </a:extLst>
                     </pic:cNvPicPr>
@@ -26210,7 +26362,7 @@
                       <a:picLocks noChangeAspect="1"/>
                       <a:extLst>
                         <a:ext uri="sm">
-                          <sm:smNativeData xmlns:sm="sm" val="SMDATA_17_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"/>
+                          <sm:smNativeData xmlns:sm="sm" val="SMDATA_17_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"/>
                         </a:ext>
                       </a:extLst>
                     </pic:cNvPicPr>
@@ -27637,6 +27789,7 @@
       <w:r>
         <w:rPr>
           <w:rStyle w:val="char4"/>
+          <w:i/>
         </w:rPr>
         <w:t>menu</w:t>
       </w:r>
@@ -27684,7 +27837,7 @@
                       <a:picLocks noChangeAspect="1"/>
                       <a:extLst>
                         <a:ext uri="sm">
-                          <sm:smNativeData xmlns:sm="sm" val="SMDATA_17_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"/>
+                          <sm:smNativeData xmlns:sm="sm" val="SMDATA_17_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"/>
                         </a:ext>
                       </a:extLst>
                     </pic:cNvPicPr>
@@ -27737,6 +27890,7 @@
       <w:r>
         <w:rPr>
           <w:rStyle w:val="char4"/>
+          <w:i/>
         </w:rPr>
         <w:t>file</w:t>
       </w:r>
@@ -27766,7 +27920,7 @@
                       <a:picLocks noChangeAspect="1"/>
                       <a:extLst>
                         <a:ext uri="sm">
-                          <sm:smNativeData xmlns:sm="sm" val="SMDATA_17_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"/>
+                          <sm:smNativeData xmlns:sm="sm" val="SMDATA_17_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"/>
                         </a:ext>
                       </a:extLst>
                     </pic:cNvPicPr>
@@ -27839,7 +27993,7 @@
                       <a:picLocks noChangeAspect="1"/>
                       <a:extLst>
                         <a:ext uri="sm">
-                          <sm:smNativeData xmlns:sm="sm" val="SMDATA_17_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"/>
+                          <sm:smNativeData xmlns:sm="sm" val="SMDATA_17_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"/>
                         </a:ext>
                       </a:extLst>
                     </pic:cNvPicPr>
@@ -27906,7 +28060,7 @@
                       <a:picLocks noChangeAspect="1"/>
                       <a:extLst>
                         <a:ext uri="sm">
-                          <sm:smNativeData xmlns:sm="sm" val="SMDATA_17_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"/>
+                          <sm:smNativeData xmlns:sm="sm" val="SMDATA_17_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"/>
                         </a:ext>
                       </a:extLst>
                     </pic:cNvPicPr>
@@ -27952,6 +28106,7 @@
       <w:r>
         <w:rPr>
           <w:rStyle w:val="char4"/>
+          <w:i/>
         </w:rPr>
         <w:t>backend</w:t>
       </w:r>
@@ -27975,6 +28130,7 @@
       <w:r>
         <w:rPr>
           <w:rStyle w:val="char4"/>
+          <w:i/>
         </w:rPr>
         <w:t>file</w:t>
       </w:r>
@@ -28006,6 +28162,7 @@
       <w:r>
         <w:rPr>
           <w:rStyle w:val="char4"/>
+          <w:i/>
         </w:rPr>
         <w:t>DTO</w:t>
       </w:r>
@@ -28015,6 +28172,7 @@
       <w:r>
         <w:rPr>
           <w:rStyle w:val="char4"/>
+          <w:i/>
         </w:rPr>
         <w:t>web</w:t>
       </w:r>
@@ -28074,6 +28232,7 @@
       <w:r>
         <w:rPr>
           <w:rStyle w:val="char11"/>
+          <w:rFonts w:eastAsia="Roboto Condensed ExtraLight" w:cs="Roboto Condensed ExtraLight"/>
         </w:rPr>
         <w:t> using </w:t>
       </w:r>
@@ -28083,6 +28242,7 @@
       <w:r>
         <w:rPr>
           <w:rStyle w:val="char4"/>
+          <w:i/>
         </w:rPr>
         <w:t>DTO</w:t>
       </w:r>
@@ -28301,6 +28461,7 @@
       <w:r>
         <w:rPr>
           <w:rStyle w:val="char4"/>
+          <w:i/>
         </w:rPr>
         <w:t>menu</w:t>
       </w:r>
@@ -28357,7 +28518,7 @@
                       <a:picLocks noChangeAspect="1"/>
                       <a:extLst>
                         <a:ext uri="sm">
-                          <sm:smNativeData xmlns:sm="sm" val="SMDATA_17_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"/>
+                          <sm:smNativeData xmlns:sm="sm" val="SMDATA_17_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"/>
                         </a:ext>
                       </a:extLst>
                     </pic:cNvPicPr>
@@ -28410,6 +28571,7 @@
       <w:r>
         <w:rPr>
           <w:rStyle w:val="char4"/>
+          <w:i/>
         </w:rPr>
         <w:t>file</w:t>
       </w:r>
@@ -28439,7 +28601,7 @@
                       <a:picLocks noChangeAspect="1"/>
                       <a:extLst>
                         <a:ext uri="sm">
-                          <sm:smNativeData xmlns:sm="sm" val="SMDATA_17_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"/>
+                          <sm:smNativeData xmlns:sm="sm" val="SMDATA_17_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"/>
                         </a:ext>
                       </a:extLst>
                     </pic:cNvPicPr>
@@ -28512,7 +28674,7 @@
                       <a:picLocks noChangeAspect="1"/>
                       <a:extLst>
                         <a:ext uri="sm">
-                          <sm:smNativeData xmlns:sm="sm" val="SMDATA_17_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"/>
+                          <sm:smNativeData xmlns:sm="sm" val="SMDATA_17_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"/>
                         </a:ext>
                       </a:extLst>
                     </pic:cNvPicPr>
@@ -28578,7 +28740,7 @@
                       <a:picLocks noChangeAspect="1"/>
                       <a:extLst>
                         <a:ext uri="sm">
-                          <sm:smNativeData xmlns:sm="sm" val="SMDATA_17_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"/>
+                          <sm:smNativeData xmlns:sm="sm" val="SMDATA_17_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"/>
                         </a:ext>
                       </a:extLst>
                     </pic:cNvPicPr>
@@ -28630,6 +28792,7 @@
       <w:r>
         <w:rPr>
           <w:rStyle w:val="char4"/>
+          <w:i/>
         </w:rPr>
         <w:t>frontend</w:t>
       </w:r>
@@ -28646,6 +28809,7 @@
       <w:r>
         <w:rPr>
           <w:rStyle w:val="char4"/>
+          <w:i/>
         </w:rPr>
         <w:t>file</w:t>
       </w:r>
@@ -28655,6 +28819,7 @@
       <w:r>
         <w:rPr>
           <w:rStyle w:val="char4"/>
+          <w:i/>
         </w:rPr>
         <w:t xml:space="preserve">file </w:t>
       </w:r>
@@ -28692,6 +28857,7 @@
       <w:r>
         <w:rPr>
           <w:rStyle w:val="char4"/>
+          <w:i/>
         </w:rPr>
         <w:t>clic</w:t>
       </w:r>
@@ -28752,7 +28918,7 @@
                       <a:picLocks noChangeAspect="1"/>
                       <a:extLst>
                         <a:ext uri="sm">
-                          <sm:smNativeData xmlns:sm="sm" val="SMDATA_17_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"/>
+                          <sm:smNativeData xmlns:sm="sm" val="SMDATA_17_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"/>
                         </a:ext>
                       </a:extLst>
                     </pic:cNvPicPr>
@@ -29114,44 +29280,46 @@
       <w:pPr>
         <w:rPr>
           <w:rFonts w:cs="Arial"/>
-          <w:b w:val="0"/>
           <w:bCs/>
-          <w:sz w:val="24"/>
           <w:szCs w:val="26"/>
         </w:rPr>
       </w:pPr>
       <w:r>
+        <w:rPr>
+          <w:rFonts w:cs="Roboto Condensed ExtraLight"/>
+        </w:rPr>
         <w:t xml:space="preserve">Nella colonna </w:t>
       </w:r>
       <w:r>
         <w:rPr>
           <w:rFonts w:cs="Arial"/>
-          <w:b w:val="0"/>
           <w:bCs/>
-          <w:sz w:val="24"/>
           <w:szCs w:val="26"/>
         </w:rPr>
         <w:t>Active solution configuration, fare clic su &lt;New…&gt;.</w:t>
       </w:r>
-    </w:p>
-    <w:p>
-      <w:pPr>
+      <w:r>
         <w:rPr>
           <w:rFonts w:cs="Arial"/>
-          <w:b w:val="0"/>
           <w:bCs/>
-          <w:sz w:val="24"/>
           <w:szCs w:val="26"/>
         </w:rPr>
-      </w:pPr>
-      <w:r>
+      </w:r>
+    </w:p>
+    <w:p>
+      <w:pPr>
         <w:rPr>
           <w:rFonts w:cs="Arial"/>
-          <w:b w:val="0"/>
           <w:bCs/>
-          <w:sz w:val="24"/>
           <w:szCs w:val="26"/>
         </w:rPr>
+      </w:pPr>
+      <w:r>
+        <w:rPr>
+          <w:rFonts w:cs="Arial"/>
+          <w:bCs/>
+          <w:szCs w:val="26"/>
+        </w:rPr>
         <w:t>Creare una nuova configurazione chiamata Development, copiando le impostazioni da Debug.</w:t>
       </w:r>
     </w:p>
@@ -29159,18 +29327,14 @@
       <w:pPr>
         <w:rPr>
           <w:rFonts w:cs="Arial"/>
-          <w:b w:val="0"/>
           <w:bCs/>
-          <w:sz w:val="24"/>
           <w:szCs w:val="26"/>
         </w:rPr>
       </w:pPr>
       <w:r>
         <w:rPr>
           <w:rFonts w:cs="Arial"/>
-          <w:b w:val="0"/>
           <w:bCs/>
-          <w:sz w:val="24"/>
           <w:szCs w:val="26"/>
         </w:rPr>
         <w:t>Ripetere la stessa operazione e creare una nuova configurazione chiamata Staging.</w:t>
@@ -29180,18 +29344,14 @@
       <w:pPr>
         <w:rPr>
           <w:rFonts w:cs="Arial"/>
-          <w:b w:val="0"/>
           <w:bCs/>
-          <w:sz w:val="24"/>
           <w:szCs w:val="26"/>
         </w:rPr>
       </w:pPr>
       <w:r>
         <w:rPr>
           <w:rFonts w:cs="Arial"/>
-          <w:b w:val="0"/>
           <w:bCs/>
-          <w:sz w:val="24"/>
           <w:szCs w:val="26"/>
         </w:rPr>
         <w:t>Ripetere una terza volta, creando la configurazione Production, copiando questa volta le impostazioni da Release.</w:t>
@@ -29201,18 +29361,14 @@
       <w:pPr>
         <w:rPr>
           <w:rFonts w:cs="Arial"/>
-          <w:b w:val="0"/>
           <w:bCs/>
-          <w:sz w:val="24"/>
           <w:szCs w:val="26"/>
         </w:rPr>
       </w:pPr>
       <w:r>
         <w:rPr>
           <w:rFonts w:cs="Arial"/>
-          <w:b w:val="0"/>
           <w:bCs/>
-          <w:sz w:val="24"/>
           <w:szCs w:val="26"/>
         </w:rPr>
         <w:t>Nella colonna Active solution configuration, fare clic su &lt;Edit…&gt;.</w:t>
@@ -29222,18 +29378,14 @@
       <w:pPr>
         <w:rPr>
           <w:rFonts w:cs="Arial"/>
-          <w:b w:val="0"/>
           <w:bCs/>
-          <w:sz w:val="24"/>
           <w:szCs w:val="26"/>
         </w:rPr>
       </w:pPr>
       <w:r>
         <w:rPr>
           <w:rFonts w:cs="Arial"/>
-          <w:b w:val="0"/>
           <w:bCs/>
-          <w:sz w:val="24"/>
           <w:szCs w:val="26"/>
         </w:rPr>
         <w:t>Rimuovere le configurazioni Debug e Release.</w:t>
@@ -29243,18 +29395,14 @@
       <w:pPr>
         <w:rPr>
           <w:rFonts w:cs="Arial"/>
-          <w:b w:val="0"/>
           <w:bCs/>
-          <w:sz w:val="24"/>
           <w:szCs w:val="26"/>
         </w:rPr>
       </w:pPr>
       <w:r>
         <w:rPr>
           <w:rFonts w:cs="Arial"/>
-          <w:b w:val="0"/>
           <w:bCs/>
-          <w:sz w:val="24"/>
           <w:szCs w:val="26"/>
         </w:rPr>
         <w:t>Ruimuovere le configurazioni Debug e Release anche dai singoli progetti della soluzione.</w:t>
@@ -30438,6 +30586,7 @@
       <w:r>
         <w:rPr>
           <w:rStyle w:val="char4"/>
+          <w:i/>
         </w:rPr>
         <w:t>menu</w:t>
       </w:r>
@@ -30845,6 +30994,7 @@
       <w:r>
         <w:rPr>
           <w:rStyle w:val="char4"/>
+          <w:i/>
         </w:rPr>
         <w:t>menu</w:t>
       </w:r>
@@ -30854,6 +31004,7 @@
       <w:r>
         <w:rPr>
           <w:rStyle w:val="char11"/>
+          <w:rFonts w:eastAsia="Roboto Condensed ExtraLight" w:cs="Roboto Condensed ExtraLight"/>
         </w:rPr>
         <w:t> &lt;AuthorizeView&gt; </w:t>
       </w:r>
@@ -30863,6 +31014,7 @@
       <w:r>
         <w:rPr>
           <w:rStyle w:val="char4"/>
+          <w:i/>
         </w:rPr>
         <w:t>menu</w:t>
       </w:r>
@@ -30872,6 +31024,7 @@
       <w:r>
         <w:rPr>
           <w:rStyle w:val="char11"/>
+          <w:rFonts w:eastAsia="Roboto Condensed ExtraLight" w:cs="Roboto Condensed ExtraLight"/>
         </w:rPr>
         <w:t> &lt;Authorized&gt; </w:t>
       </w:r>
@@ -30881,6 +31034,7 @@
       <w:r>
         <w:rPr>
           <w:rStyle w:val="char4"/>
+          <w:i/>
         </w:rPr>
         <w:t>menu</w:t>
       </w:r>
@@ -30890,6 +31044,7 @@
       <w:r>
         <w:rPr>
           <w:rStyle w:val="char11"/>
+          <w:rFonts w:eastAsia="Roboto Condensed ExtraLight" w:cs="Roboto Condensed ExtraLight"/>
         </w:rPr>
         <w:t> &lt;NotAuthorized&gt; </w:t>
       </w:r>
@@ -30899,6 +31054,7 @@
       <w:r>
         <w:rPr>
           <w:rStyle w:val="char11"/>
+          <w:rFonts w:eastAsia="Roboto Condensed ExtraLight" w:cs="Roboto Condensed ExtraLight"/>
         </w:rPr>
         <w:t> &lt;/NotAuthorized&gt; </w:t>
       </w:r>
@@ -30914,11 +31070,15 @@
         </w:rPr>
       </w:pPr>
       <w:r>
+        <w:rPr>
+          <w:rFonts w:ascii="Roboto Condensed ExtraLight" w:hAnsi="Roboto Condensed ExtraLight"/>
+        </w:rPr>
         <w:t xml:space="preserve">Per poter utilizzare i componenti sopra descritti, occorre che lo stato di autenticazione sia noto ai componenti in cui sono utilizzati. La propagazione dello stato di autenticazione si ottiene includendo il router del progetto nel componente </w:t>
       </w:r>
       <w:r>
         <w:rPr>
           <w:rStyle w:val="char11"/>
+          <w:rFonts w:eastAsia="Roboto Condensed ExtraLight" w:cs="Roboto Condensed ExtraLight"/>
         </w:rPr>
         <w:t> &lt;CascadingAuthenticationState&gt; </w:t>
       </w:r>
@@ -31333,6 +31493,7 @@
       <w:r>
         <w:rPr>
           <w:rStyle w:val="char4"/>
+          <w:i/>
         </w:rPr>
         <w:t>menu</w:t>
       </w:r>
@@ -31362,7 +31523,7 @@
                       <a:picLocks noChangeAspect="1"/>
                       <a:extLst>
                         <a:ext uri="sm">
-                          <sm:smNativeData xmlns:sm="sm" val="SMDATA_17_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"/>
+                          <sm:smNativeData xmlns:sm="sm" val="SMDATA_17_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"/>
                         </a:ext>
                       </a:extLst>
                     </pic:cNvPicPr>
@@ -32680,16 +32841,1634 @@
     </w:p>
     <w:p>
       <w:pPr>
-        <w:rPr>
-          <w:rFonts w:ascii="Victor Mono Light" w:hAnsi="Victor Mono Light"/>
-          <w:sz w:val="20"/>
-        </w:rPr>
-      </w:pPr>
-      <w:r>
-        <w:rPr>
-          <w:rFonts w:ascii="Victor Mono Light" w:hAnsi="Victor Mono Light"/>
-          <w:sz w:val="20"/>
-        </w:rPr>
+        <w:pStyle w:val="para1"/>
+      </w:pPr>
+      <w:r>
+        <w:t>Da Everyware ad ADI Console</w:t>
+      </w:r>
+    </w:p>
+    <w:p>
+      <w:pPr>
+        <w:pStyle w:val="para2"/>
+      </w:pPr>
+      <w:r>
+        <w:t>Gestione della navigazione</w:t>
+      </w:r>
+    </w:p>
+    <w:p>
+      <w:pPr>
+        <w:pStyle w:val="para3"/>
+      </w:pPr>
+      <w:r>
+        <w:t>Il componente app.razor</w:t>
+      </w:r>
+    </w:p>
+    <w:p>
+      <w:r>
+        <w:t>App.razor rappresenta il cuore di un applicativo Blazor WebAssembly, il primo componente che viene renderizzato quasi si avvia il sistema. In parole semplici rappresenta il punto di ingresso del programma lato client. Il componente app.razor si occupa di decidere quale pagina mostrare, definisce il layout globale e gestisce le pagine non trovate (</w:t>
+      </w:r>
+      <w:r>
+        <w:rPr>
+          <w:rStyle w:val="char4"/>
+          <w:i/>
+        </w:rPr>
+        <w:t>status code</w:t>
+      </w:r>
+      <w:r>
+        <w:t xml:space="preserve"> 404) e quelle non autorizzate (</w:t>
+      </w:r>
+      <w:r>
+        <w:rPr>
+          <w:rStyle w:val="char4"/>
+          <w:i/>
+        </w:rPr>
+        <w:t>status code</w:t>
+      </w:r>
+      <w:r>
+        <w:t xml:space="preserve"> 403).</w:t>
+      </w:r>
+    </w:p>
+    <w:p>
+      <w:pPr>
+        <w:pStyle w:val="para3"/>
+      </w:pPr>
+      <w:r>
+        <w:t>Pagina non trovata</w:t>
+      </w:r>
+    </w:p>
+    <w:p>
+      <w:r>
+        <w:t>Se una pagina non si trova dove il sistema si aspetta che sia, per qualsiasi motivo, occorre avvisare gli utenti del problema. Questa incombenza tocca al componente App.razor.</w:t>
+      </w:r>
+    </w:p>
+    <w:p>
+      <w:pPr>
+        <w:pStyle w:val="para7"/>
+      </w:pPr>
+      <w:r>
+        <w:t>…</w:t>
+      </w:r>
+    </w:p>
+    <w:p>
+      <w:pPr>
+        <w:pStyle w:val="para7"/>
+      </w:pPr>
+      <w:r>
+        <w:t>&lt;CascadingAuthenticationState&gt;</w:t>
+      </w:r>
+    </w:p>
+    <w:p>
+      <w:pPr>
+        <w:pStyle w:val="para7"/>
+      </w:pPr>
+      <w:r>
+        <w:t xml:space="preserve">    &lt;Router AppAssembly="@typeof(App).Assembly"&gt;</w:t>
+      </w:r>
+    </w:p>
+    <w:p>
+      <w:pPr>
+        <w:pStyle w:val="para7"/>
+      </w:pPr>
+      <w:r>
+        <w:t xml:space="preserve">        &lt;Found Context="routeData"&gt;</w:t>
+      </w:r>
+    </w:p>
+    <w:p>
+      <w:pPr>
+        <w:pStyle w:val="para7"/>
+      </w:pPr>
+      <w:r>
+        <w:t xml:space="preserve">            &lt;PageTitle&gt;@routeData.PageType.Name&lt;/PageTitle&gt;</w:t>
+      </w:r>
+    </w:p>
+    <w:p>
+      <w:pPr>
+        <w:pStyle w:val="para7"/>
+      </w:pPr>
+      <w:r>
+        <w:t xml:space="preserve">            &lt;RouteView RouteData="@routeData" DefaultLayout="@typeof(MainLayout)" /&gt;</w:t>
+      </w:r>
+    </w:p>
+    <w:p>
+      <w:pPr>
+        <w:pStyle w:val="para7"/>
+      </w:pPr>
+      <w:r>
+        <w:t xml:space="preserve">            &lt;FocusOnNavigate RouteData="@routeData" Selector="h1" /&gt;</w:t>
+      </w:r>
+    </w:p>
+    <w:p>
+      <w:pPr>
+        <w:pStyle w:val="para7"/>
+      </w:pPr>
+      <w:r>
+        <w:t xml:space="preserve">        &lt;/Found&gt;</w:t>
+      </w:r>
+    </w:p>
+    <w:p>
+      <w:pPr>
+        <w:pStyle w:val="para7"/>
+      </w:pPr>
+      <w:r>
+        <w:t xml:space="preserve">        &lt;NotFound&gt;</w:t>
+      </w:r>
+    </w:p>
+    <w:p>
+      <w:pPr>
+        <w:pStyle w:val="para7"/>
+        <w:rPr>
+          <w:strike w:val="1"/>
+          <w:color w:val="007f7f"/>
+        </w:rPr>
+      </w:pPr>
+      <w:r>
+        <w:rPr>
+          <w:strike w:val="1"/>
+          <w:color w:val="007f7f"/>
+        </w:rPr>
+        <w:t xml:space="preserve">            &lt;LayoutView Layout="@typeof(MainLayout)"&gt;</w:t>
+      </w:r>
+    </w:p>
+    <w:p>
+      <w:pPr>
+        <w:pStyle w:val="para7"/>
+        <w:rPr>
+          <w:strike w:val="1"/>
+          <w:color w:val="007f7f"/>
+        </w:rPr>
+      </w:pPr>
+      <w:r>
+        <w:rPr>
+          <w:strike w:val="1"/>
+          <w:color w:val="007f7f"/>
+        </w:rPr>
+        <w:t xml:space="preserve">                &lt;p&gt;Sorry, there's nothing at this address.&lt;/p&gt;</w:t>
+      </w:r>
+    </w:p>
+    <w:p>
+      <w:pPr>
+        <w:pStyle w:val="para7"/>
+        <w:rPr>
+          <w:strike w:val="1"/>
+          <w:color w:val="007f7f"/>
+        </w:rPr>
+      </w:pPr>
+      <w:r>
+        <w:rPr>
+          <w:strike w:val="1"/>
+          <w:color w:val="007f7f"/>
+        </w:rPr>
+        <w:t xml:space="preserve">            &lt;/LayoutView&gt;</w:t>
+      </w:r>
+    </w:p>
+    <w:p>
+      <w:pPr>
+        <w:pStyle w:val="para7"/>
+        <w:rPr>
+          <w:color w:val="007f7f"/>
+        </w:rPr>
+      </w:pPr>
+      <w:r>
+        <w:rPr>
+          <w:color w:val="007f7f"/>
+        </w:rPr>
+        <w:t xml:space="preserve">            &lt;LayoutView Layout="@typeof(MainLayout)"&gt;</w:t>
+      </w:r>
+    </w:p>
+    <w:p>
+      <w:pPr>
+        <w:pStyle w:val="para7"/>
+        <w:rPr>
+          <w:color w:val="007f7f"/>
+        </w:rPr>
+      </w:pPr>
+      <w:r>
+        <w:rPr>
+          <w:color w:val="007f7f"/>
+        </w:rPr>
+        <w:t xml:space="preserve">                &lt;h1 style="font-size:128px; margin-bottom: 2rem;"&gt;</w:t>
+      </w:r>
+      <w:r>
+        <w:rPr>
+          <w:noProof/>
+        </w:rPr>
+        <w:drawing>
+          <wp:inline distT="89535" distB="89535" distL="89535" distR="89535">
+            <wp:extent cx="89535" cy="88265"/>
+            <wp:effectExtent l="0" t="0" r="0" b="0"/>
+            <wp:docPr id="60" name="Picture208"/>
+            <wp:cNvGraphicFramePr>
+              <a:graphicFrameLocks xmlns:a="http://schemas.openxmlformats.org/drawingml/2006/main" noChangeAspect="1"/>
+            </wp:cNvGraphicFramePr>
+            <a:graphic xmlns:a="http://schemas.openxmlformats.org/drawingml/2006/main">
+              <a:graphicData uri="http://schemas.openxmlformats.org/drawingml/2006/picture">
+                <pic:pic xmlns:pic="http://schemas.openxmlformats.org/drawingml/2006/picture">
+                  <pic:nvPicPr>
+                    <pic:cNvPr id="60" name="Picture208"/>
+                    <pic:cNvPicPr>
+                      <a:picLocks noChangeAspect="1"/>
+                      <a:codePr string="" type="-174920560" text="1"/>
+                      <a:extLst>
+                        <a:ext uri="sm">
+                          <sm:smNativeData xmlns:sm="sm" val="SMDATA_17_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"/>
+                        </a:ext>
+                      </a:extLst>
+                    </pic:cNvPicPr>
+                  </pic:nvPicPr>
+                  <pic:blipFill>
+                    <a:blip r:embed="rId67"/>
+                    <a:stretch>
+                      <a:fillRect/>
+                    </a:stretch>
+                  </pic:blipFill>
+                  <pic:spPr>
+                    <a:xfrm>
+                      <a:off x="0" y="0"/>
+                      <a:ext cx="89535" cy="88265"/>
+                    </a:xfrm>
+                    <a:prstGeom prst="rect">
+                      <a:avLst/>
+                    </a:prstGeom>
+                    <a:noFill/>
+                    <a:ln w="12700">
+                      <a:noFill/>
+                    </a:ln>
+                  </pic:spPr>
+                </pic:pic>
+              </a:graphicData>
+            </a:graphic>
+          </wp:inline>
+        </w:drawing>
+      </w:r>
+      <w:r>
+        <w:rPr>
+          <w:color w:val="007f7f"/>
+        </w:rPr>
+        <w:t>&lt;/h1&gt;</w:t>
+      </w:r>
+    </w:p>
+    <w:p>
+      <w:pPr>
+        <w:pStyle w:val="para7"/>
+        <w:rPr>
+          <w:color w:val="007f7f"/>
+        </w:rPr>
+      </w:pPr>
+      <w:r>
+        <w:rPr>
+          <w:color w:val="007f7f"/>
+        </w:rPr>
+        <w:t xml:space="preserve">                &lt;h1&gt;404 – R.I.P.&lt;/h1&gt;</w:t>
+      </w:r>
+    </w:p>
+    <w:p>
+      <w:pPr>
+        <w:pStyle w:val="para7"/>
+        <w:rPr>
+          <w:color w:val="007f7f"/>
+        </w:rPr>
+      </w:pPr>
+      <w:r>
+        <w:rPr>
+          <w:color w:val="007f7f"/>
+        </w:rPr>
+        <w:t xml:space="preserve">                &lt;p&gt;This page is no longer among us.&lt;/p&gt;</w:t>
+      </w:r>
+    </w:p>
+    <w:p>
+      <w:pPr>
+        <w:pStyle w:val="para7"/>
+        <w:rPr>
+          <w:color w:val="007f7f"/>
+        </w:rPr>
+      </w:pPr>
+      <w:r>
+        <w:rPr>
+          <w:color w:val="007f7f"/>
+        </w:rPr>
+        <w:t xml:space="preserve">                &lt;p&gt;Maybe you can retry later.&lt;/p&gt;</w:t>
+      </w:r>
+    </w:p>
+    <w:p>
+      <w:pPr>
+        <w:pStyle w:val="para7"/>
+        <w:rPr>
+          <w:color w:val="007f7f"/>
+        </w:rPr>
+      </w:pPr>
+      <w:r>
+        <w:rPr>
+          <w:color w:val="007f7f"/>
+        </w:rPr>
+        <w:t xml:space="preserve">            &lt;/LayoutView&gt;</w:t>
+      </w:r>
+    </w:p>
+    <w:p>
+      <w:pPr>
+        <w:pStyle w:val="para7"/>
+      </w:pPr>
+      <w:r>
+        <w:t xml:space="preserve">        &lt;/NotFound&gt;</w:t>
+      </w:r>
+    </w:p>
+    <w:p>
+      <w:pPr>
+        <w:pStyle w:val="para7"/>
+      </w:pPr>
+      <w:r>
+        <w:t xml:space="preserve">    &lt;/Router&gt;</w:t>
+      </w:r>
+    </w:p>
+    <w:p>
+      <w:pPr>
+        <w:pStyle w:val="para7"/>
+      </w:pPr>
+      <w:r>
+        <w:t>&lt;/CascadingAuthenticationState&gt;</w:t>
+      </w:r>
+    </w:p>
+    <w:p>
+      <w:pPr>
+        <w:pStyle w:val="para3"/>
+      </w:pPr>
+      <w:r>
+        <w:t>Accesso negato</w:t>
+      </w:r>
+    </w:p>
+    <w:p>
+      <w:r>
+        <w:t>Se una pagina richiede un utente autorizzato per essere visitata, occorre informare gli utenti della situazione. Anche in questo caso entra in gioco il componente App.razor.</w:t>
+      </w:r>
+    </w:p>
+    <w:p>
+      <w:pPr>
+        <w:pStyle w:val="para7"/>
+      </w:pPr>
+      <w:r>
+        <w:t>…</w:t>
+      </w:r>
+    </w:p>
+    <w:p>
+      <w:pPr>
+        <w:pStyle w:val="para7"/>
+      </w:pPr>
+      <w:r>
+        <w:t>&lt;CascadingAuthenticationState&gt;</w:t>
+      </w:r>
+    </w:p>
+    <w:p>
+      <w:pPr>
+        <w:pStyle w:val="para7"/>
+      </w:pPr>
+      <w:r>
+        <w:t xml:space="preserve">    &lt;Router AppAssembly="@typeof(App).Assembly"&gt;</w:t>
+      </w:r>
+    </w:p>
+    <w:p>
+      <w:pPr>
+        <w:pStyle w:val="para7"/>
+      </w:pPr>
+      <w:r>
+        <w:t xml:space="preserve">        &lt;Found Context="routeData"&gt;</w:t>
+      </w:r>
+    </w:p>
+    <w:p>
+      <w:pPr>
+        <w:pStyle w:val="para7"/>
+        <w:rPr>
+          <w:strike w:val="1"/>
+          <w:color w:val="007f7f"/>
+        </w:rPr>
+      </w:pPr>
+      <w:r>
+        <w:rPr>
+          <w:strike w:val="1"/>
+          <w:color w:val="007f7f"/>
+        </w:rPr>
+        <w:t xml:space="preserve">            &lt;PageTitle&gt;@routeData.PageType.Name&lt;/PageTitle&gt;</w:t>
+      </w:r>
+    </w:p>
+    <w:p>
+      <w:pPr>
+        <w:pStyle w:val="para7"/>
+        <w:rPr>
+          <w:strike w:val="1"/>
+          <w:color w:val="007f7f"/>
+        </w:rPr>
+      </w:pPr>
+      <w:r>
+        <w:rPr>
+          <w:strike w:val="1"/>
+          <w:color w:val="007f7f"/>
+        </w:rPr>
+        <w:t xml:space="preserve">            &lt;RouteView RouteData="@routeData" DefaultLayout="@typeof(MainLayout)" /&gt;</w:t>
+      </w:r>
+    </w:p>
+    <w:p>
+      <w:pPr>
+        <w:pStyle w:val="para7"/>
+        <w:rPr>
+          <w:strike w:val="1"/>
+          <w:color w:val="007f7f"/>
+        </w:rPr>
+      </w:pPr>
+      <w:r>
+        <w:rPr>
+          <w:strike w:val="1"/>
+          <w:color w:val="007f7f"/>
+        </w:rPr>
+        <w:t xml:space="preserve">            &lt;FocusOnNavigate RouteData="@routeData" Selector="h1" /&gt;</w:t>
+      </w:r>
+    </w:p>
+    <w:p>
+      <w:pPr>
+        <w:pStyle w:val="para7"/>
+        <w:rPr>
+          <w:color w:val="007f7f"/>
+        </w:rPr>
+      </w:pPr>
+      <w:r>
+        <w:rPr>
+          <w:color w:val="007f7f"/>
+        </w:rPr>
+        <w:t xml:space="preserve">            &lt;AuthorizeRouteView RouteData="@routeData" DefaultLayout="@typeof(MainLayout)"&gt;</w:t>
+      </w:r>
+    </w:p>
+    <w:p>
+      <w:pPr>
+        <w:pStyle w:val="para7"/>
+        <w:rPr>
+          <w:color w:val="007f7f"/>
+        </w:rPr>
+      </w:pPr>
+      <w:r>
+        <w:rPr>
+          <w:color w:val="007f7f"/>
+        </w:rPr>
+        <w:t xml:space="preserve">                &lt;NotAuthorized&gt;</w:t>
+      </w:r>
+    </w:p>
+    <w:p>
+      <w:pPr>
+        <w:pStyle w:val="para7"/>
+        <w:rPr>
+          <w:color w:val="007f7f"/>
+        </w:rPr>
+      </w:pPr>
+      <w:r>
+        <w:rPr>
+          <w:color w:val="007f7f"/>
+        </w:rPr>
+        <w:t xml:space="preserve">                    &lt;h1 style="font-size:128px; margin-bottom: 2rem;"&gt;</w:t>
+      </w:r>
+      <w:r>
+        <w:rPr>
+          <w:noProof/>
+        </w:rPr>
+        <w:drawing>
+          <wp:inline distT="89535" distB="89535" distL="89535" distR="89535">
+            <wp:extent cx="89535" cy="88265"/>
+            <wp:effectExtent l="0" t="0" r="0" b="0"/>
+            <wp:docPr id="61" name="Picture207"/>
+            <wp:cNvGraphicFramePr>
+              <a:graphicFrameLocks xmlns:a="http://schemas.openxmlformats.org/drawingml/2006/main" noChangeAspect="1"/>
+            </wp:cNvGraphicFramePr>
+            <a:graphic xmlns:a="http://schemas.openxmlformats.org/drawingml/2006/main">
+              <a:graphicData uri="http://schemas.openxmlformats.org/drawingml/2006/picture">
+                <pic:pic xmlns:pic="http://schemas.openxmlformats.org/drawingml/2006/picture">
+                  <pic:nvPicPr>
+                    <pic:cNvPr id="61" name="Picture207"/>
+                    <pic:cNvPicPr>
+                      <a:picLocks noChangeAspect="1"/>
+                      <a:codePr string="" type="-174920560" text="1"/>
+                      <a:extLst>
+                        <a:ext uri="sm">
+                          <sm:smNativeData xmlns:sm="sm" val="SMDATA_17_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"/>
+                        </a:ext>
+                      </a:extLst>
+                    </pic:cNvPicPr>
+                  </pic:nvPicPr>
+                  <pic:blipFill>
+                    <a:blip r:embed="rId68"/>
+                    <a:stretch>
+                      <a:fillRect/>
+                    </a:stretch>
+                  </pic:blipFill>
+                  <pic:spPr>
+                    <a:xfrm>
+                      <a:off x="0" y="0"/>
+                      <a:ext cx="89535" cy="88265"/>
+                    </a:xfrm>
+                    <a:prstGeom prst="rect">
+                      <a:avLst/>
+                    </a:prstGeom>
+                    <a:noFill/>
+                    <a:ln w="12700">
+                      <a:noFill/>
+                    </a:ln>
+                  </pic:spPr>
+                </pic:pic>
+              </a:graphicData>
+            </a:graphic>
+          </wp:inline>
+        </w:drawing>
+      </w:r>
+      <w:r>
+        <w:rPr>
+          <w:color w:val="007f7f"/>
+        </w:rPr>
+        <w:t>&lt;/h1&gt;</w:t>
+      </w:r>
+    </w:p>
+    <w:p>
+      <w:pPr>
+        <w:pStyle w:val="para7"/>
+        <w:rPr>
+          <w:color w:val="007f7f"/>
+        </w:rPr>
+      </w:pPr>
+      <w:r>
+        <w:rPr>
+          <w:color w:val="007f7f"/>
+        </w:rPr>
+        <w:t xml:space="preserve">                    &lt;h1&gt;403 - You Shall Not Pass&lt;/h1&gt;</w:t>
+      </w:r>
+    </w:p>
+    <w:p>
+      <w:pPr>
+        <w:pStyle w:val="para7"/>
+        <w:rPr>
+          <w:color w:val="007f7f"/>
+        </w:rPr>
+      </w:pPr>
+      <w:r>
+        <w:rPr>
+          <w:color w:val="007f7f"/>
+        </w:rPr>
+        <w:t xml:space="preserve">                    &lt;p&gt;You are not allowed to access this page.&lt;/p&gt;</w:t>
+      </w:r>
+    </w:p>
+    <w:p>
+      <w:pPr>
+        <w:pStyle w:val="para7"/>
+        <w:rPr>
+          <w:color w:val="007f7f"/>
+        </w:rPr>
+      </w:pPr>
+      <w:r>
+        <w:rPr>
+          <w:color w:val="007f7f"/>
+        </w:rPr>
+        <w:t xml:space="preserve">                    &lt;p&gt;Please identify yourself.&lt;/p&gt;</w:t>
+      </w:r>
+    </w:p>
+    <w:p>
+      <w:pPr>
+        <w:pStyle w:val="para7"/>
+        <w:rPr>
+          <w:color w:val="007f7f"/>
+        </w:rPr>
+      </w:pPr>
+      <w:r>
+        <w:rPr>
+          <w:color w:val="007f7f"/>
+        </w:rPr>
+        <w:t xml:space="preserve">                &lt;/NotAuthorized&gt;</w:t>
+      </w:r>
+    </w:p>
+    <w:p>
+      <w:pPr>
+        <w:pStyle w:val="para7"/>
+        <w:rPr>
+          <w:color w:val="007f7f"/>
+        </w:rPr>
+      </w:pPr>
+      <w:r>
+        <w:rPr>
+          <w:color w:val="007f7f"/>
+        </w:rPr>
+        <w:t xml:space="preserve">                &lt;Authorizing&gt;</w:t>
+      </w:r>
+    </w:p>
+    <w:p>
+      <w:pPr>
+        <w:pStyle w:val="para7"/>
+        <w:rPr>
+          <w:color w:val="007f7f"/>
+        </w:rPr>
+      </w:pPr>
+      <w:r>
+        <w:rPr>
+          <w:color w:val="007f7f"/>
+        </w:rPr>
+        <w:t xml:space="preserve">                    &lt;h1 style="font-size:128px; margin-bottom: 2rem;"&gt;</w:t>
+      </w:r>
+      <w:r>
+        <w:rPr>
+          <w:noProof/>
+        </w:rPr>
+        <w:drawing>
+          <wp:inline distT="89535" distB="89535" distL="89535" distR="89535">
+            <wp:extent cx="89535" cy="88265"/>
+            <wp:effectExtent l="0" t="0" r="0" b="0"/>
+            <wp:docPr id="62" name="Picture209"/>
+            <wp:cNvGraphicFramePr>
+              <a:graphicFrameLocks xmlns:a="http://schemas.openxmlformats.org/drawingml/2006/main" noChangeAspect="1"/>
+            </wp:cNvGraphicFramePr>
+            <a:graphic xmlns:a="http://schemas.openxmlformats.org/drawingml/2006/main">
+              <a:graphicData uri="http://schemas.openxmlformats.org/drawingml/2006/picture">
+                <pic:pic xmlns:pic="http://schemas.openxmlformats.org/drawingml/2006/picture">
+                  <pic:nvPicPr>
+                    <pic:cNvPr id="62" name="Picture209"/>
+                    <pic:cNvPicPr>
+                      <a:picLocks noChangeAspect="1"/>
+                      <a:codePr string="" type="-174920560" text="1"/>
+                      <a:extLst>
+                        <a:ext uri="sm">
+                          <sm:smNativeData xmlns:sm="sm" val="SMDATA_17_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"/>
+                        </a:ext>
+                      </a:extLst>
+                    </pic:cNvPicPr>
+                  </pic:nvPicPr>
+                  <pic:blipFill>
+                    <a:blip r:embed="rId69"/>
+                    <a:stretch>
+                      <a:fillRect/>
+                    </a:stretch>
+                  </pic:blipFill>
+                  <pic:spPr>
+                    <a:xfrm>
+                      <a:off x="0" y="0"/>
+                      <a:ext cx="89535" cy="88265"/>
+                    </a:xfrm>
+                    <a:prstGeom prst="rect">
+                      <a:avLst/>
+                    </a:prstGeom>
+                    <a:noFill/>
+                    <a:ln w="12700">
+                      <a:noFill/>
+                    </a:ln>
+                  </pic:spPr>
+                </pic:pic>
+              </a:graphicData>
+            </a:graphic>
+          </wp:inline>
+        </w:drawing>
+      </w:r>
+      <w:r>
+        <w:rPr>
+          <w:color w:val="007f7f"/>
+        </w:rPr>
+        <w:t>&lt;/h1&gt;</w:t>
+      </w:r>
+    </w:p>
+    <w:p>
+      <w:pPr>
+        <w:pStyle w:val="para7"/>
+        <w:rPr>
+          <w:color w:val="007f7f"/>
+        </w:rPr>
+      </w:pPr>
+      <w:r>
+        <w:rPr>
+          <w:color w:val="007f7f"/>
+        </w:rPr>
+        <w:t xml:space="preserve">                    &lt;h1&gt;Authorizing...&lt;/h1&gt;</w:t>
+      </w:r>
+    </w:p>
+    <w:p>
+      <w:pPr>
+        <w:pStyle w:val="para7"/>
+        <w:rPr>
+          <w:color w:val="007f7f"/>
+        </w:rPr>
+      </w:pPr>
+      <w:r>
+        <w:rPr>
+          <w:color w:val="007f7f"/>
+        </w:rPr>
+        <w:t xml:space="preserve">                    &lt;p&gt;I swear this won’t take too long.&lt;/p&gt;</w:t>
+      </w:r>
+    </w:p>
+    <w:p>
+      <w:pPr>
+        <w:pStyle w:val="para7"/>
+        <w:rPr>
+          <w:color w:val="007f7f"/>
+        </w:rPr>
+      </w:pPr>
+      <w:r>
+        <w:rPr>
+          <w:color w:val="007f7f"/>
+        </w:rPr>
+        <w:t xml:space="preserve">                    &lt;p&gt;Please be patient.&lt;/p&gt;</w:t>
+      </w:r>
+    </w:p>
+    <w:p>
+      <w:pPr>
+        <w:pStyle w:val="para7"/>
+        <w:rPr>
+          <w:color w:val="007f7f"/>
+        </w:rPr>
+      </w:pPr>
+      <w:r>
+        <w:rPr>
+          <w:color w:val="007f7f"/>
+        </w:rPr>
+        <w:t xml:space="preserve">                &lt;/Authorizing&gt;</w:t>
+      </w:r>
+    </w:p>
+    <w:p>
+      <w:pPr>
+        <w:pStyle w:val="para7"/>
+        <w:rPr>
+          <w:color w:val="007f7f"/>
+        </w:rPr>
+      </w:pPr>
+      <w:r>
+        <w:rPr>
+          <w:color w:val="007f7f"/>
+        </w:rPr>
+        <w:t xml:space="preserve">            &lt;/AuthorizeRouteView&gt;</w:t>
+      </w:r>
+    </w:p>
+    <w:p>
+      <w:pPr>
+        <w:pStyle w:val="para7"/>
+      </w:pPr>
+      <w:r>
+        <w:t xml:space="preserve">        &lt;/Found&gt;</w:t>
+      </w:r>
+    </w:p>
+    <w:p>
+      <w:pPr>
+        <w:pStyle w:val="para7"/>
+      </w:pPr>
+      <w:r>
+        <w:t xml:space="preserve">        &lt;NotFound&gt;</w:t>
+      </w:r>
+    </w:p>
+    <w:p>
+      <w:pPr>
+        <w:pStyle w:val="para7"/>
+      </w:pPr>
+      <w:r>
+        <w:t xml:space="preserve">            &lt;LayoutView Layout="@typeof(MainLayout)"&gt;</w:t>
+      </w:r>
+    </w:p>
+    <w:p>
+      <w:pPr>
+        <w:pStyle w:val="para7"/>
+      </w:pPr>
+      <w:r>
+        <w:t xml:space="preserve">                &lt;h1 style="font-size:128px; margin-bottom: 2rem;"&gt;</w:t>
+      </w:r>
+      <w:r>
+        <w:rPr>
+          <w:color w:val="007f7f"/>
+        </w:rPr>
+      </w:r>
+      <w:r>
+        <w:rPr>
+          <w:noProof/>
+        </w:rPr>
+        <w:drawing>
+          <wp:inline distT="89535" distB="89535" distL="89535" distR="89535">
+            <wp:extent cx="89535" cy="88265"/>
+            <wp:effectExtent l="0" t="0" r="0" b="0"/>
+            <wp:docPr id="63" name="Picture208"/>
+            <wp:cNvGraphicFramePr>
+              <a:graphicFrameLocks xmlns:a="http://schemas.openxmlformats.org/drawingml/2006/main" noChangeAspect="1"/>
+            </wp:cNvGraphicFramePr>
+            <a:graphic xmlns:a="http://schemas.openxmlformats.org/drawingml/2006/main">
+              <a:graphicData uri="http://schemas.openxmlformats.org/drawingml/2006/picture">
+                <pic:pic xmlns:pic="http://schemas.openxmlformats.org/drawingml/2006/picture">
+                  <pic:nvPicPr>
+                    <pic:cNvPr id="63" name="Picture208"/>
+                    <pic:cNvPicPr>
+                      <a:picLocks noChangeAspect="1"/>
+                      <a:codePr string="" type="-174920560" text="1"/>
+                      <a:extLst>
+                        <a:ext uri="sm">
+                          <sm:smNativeData xmlns:sm="sm" val="SMDATA_17_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"/>
+                        </a:ext>
+                      </a:extLst>
+                    </pic:cNvPicPr>
+                  </pic:nvPicPr>
+                  <pic:blipFill>
+                    <a:blip r:embed="rId67"/>
+                    <a:stretch>
+                      <a:fillRect/>
+                    </a:stretch>
+                  </pic:blipFill>
+                  <pic:spPr>
+                    <a:xfrm>
+                      <a:off x="0" y="0"/>
+                      <a:ext cx="89535" cy="88265"/>
+                    </a:xfrm>
+                    <a:prstGeom prst="rect">
+                      <a:avLst/>
+                    </a:prstGeom>
+                    <a:noFill/>
+                    <a:ln w="12700">
+                      <a:noFill/>
+                    </a:ln>
+                  </pic:spPr>
+                </pic:pic>
+              </a:graphicData>
+            </a:graphic>
+          </wp:inline>
+        </w:drawing>
+      </w:r>
+      <w:r>
+        <w:rPr>
+          <w:color w:val="007f7f"/>
+        </w:rPr>
+      </w:r>
+      <w:r>
+        <w:t>&lt;/h1&gt;</w:t>
+      </w:r>
+    </w:p>
+    <w:p>
+      <w:pPr>
+        <w:pStyle w:val="para7"/>
+      </w:pPr>
+      <w:r>
+        <w:t xml:space="preserve">                &lt;h1&gt;404 – R.I.P.&lt;/h1&gt;</w:t>
+      </w:r>
+    </w:p>
+    <w:p>
+      <w:pPr>
+        <w:pStyle w:val="para7"/>
+      </w:pPr>
+      <w:r>
+        <w:t xml:space="preserve">                &lt;p&gt;This page is no longer among us.&lt;/p&gt;</w:t>
+      </w:r>
+    </w:p>
+    <w:p>
+      <w:pPr>
+        <w:pStyle w:val="para7"/>
+      </w:pPr>
+      <w:r>
+        <w:t xml:space="preserve">                &lt;p&gt;Please stay faithful.&lt;/p&gt;</w:t>
+      </w:r>
+    </w:p>
+    <w:p>
+      <w:pPr>
+        <w:pStyle w:val="para7"/>
+      </w:pPr>
+      <w:r>
+        <w:t xml:space="preserve">            &lt;/LayoutView&gt;</w:t>
+      </w:r>
+    </w:p>
+    <w:p>
+      <w:pPr>
+        <w:pStyle w:val="para7"/>
+      </w:pPr>
+      <w:r>
+        <w:t xml:space="preserve">        &lt;/NotFound&gt;</w:t>
+      </w:r>
+    </w:p>
+    <w:p>
+      <w:pPr>
+        <w:pStyle w:val="para7"/>
+      </w:pPr>
+      <w:r>
+        <w:t xml:space="preserve">    &lt;/Router&gt;</w:t>
+      </w:r>
+    </w:p>
+    <w:p>
+      <w:pPr>
+        <w:pStyle w:val="para7"/>
+      </w:pPr>
+      <w:r>
+        <w:t>&lt;/CascadingAuthenticationState&gt;</w:t>
+      </w:r>
+    </w:p>
+    <w:p>
+      <w:pPr>
+        <w:pStyle w:val="para3"/>
+      </w:pPr>
+      <w:r>
+        <w:t>Errore non previsto</w:t>
+      </w:r>
+    </w:p>
+    <w:p>
+      <w:r>
+        <w:t xml:space="preserve">Gli errori non gestiti che avvengono durante il </w:t>
+      </w:r>
+      <w:r>
+        <w:rPr>
+          <w:rStyle w:val="char4"/>
+          <w:i/>
+        </w:rPr>
+        <w:t>rendering</w:t>
+      </w:r>
+      <w:r>
+        <w:t xml:space="preserve"> dei componenti </w:t>
+      </w:r>
+      <w:r>
+        <w:rPr>
+          <w:rFonts w:ascii="Roboto Serif 36pt" w:hAnsi="Roboto Serif 36pt" w:eastAsia="Roboto Serif 36pt" w:cs="Roboto Serif 36pt"/>
+        </w:rPr>
+        <w:t>Blazor</w:t>
+      </w:r>
+      <w:r>
+        <w:t xml:space="preserve"> possono essere intercettati nel componente </w:t>
+      </w:r>
+      <w:r>
+        <w:rPr>
+          <w:rFonts w:ascii="Operator Mono Medium" w:hAnsi="Operator Mono Medium" w:eastAsia="Operator Mono Medium" w:cs="Operator Mono Medium"/>
+          <w:highlight w:val="lightGray"/>
+        </w:rPr>
+        <w:t> App.razor</w:t>
+      </w:r>
+      <w:r>
+        <w:rPr>
+          <w:highlight w:val="lightGray"/>
+        </w:rPr>
+        <w:t> </w:t>
+      </w:r>
+      <w:r>
+        <w:t>, utilizzando il componente ErrorBoundary.</w:t>
+      </w:r>
+    </w:p>
+    <w:p>
+      <w:pPr>
+        <w:pStyle w:val="para7"/>
+      </w:pPr>
+      <w:r>
+        <w:t>&lt;CascadingAuthenticationState&gt;</w:t>
+      </w:r>
+    </w:p>
+    <w:p>
+      <w:pPr>
+        <w:pStyle w:val="para7"/>
+      </w:pPr>
+      <w:r>
+        <w:t xml:space="preserve">    &lt;Router AppAssembly="@typeof(App).Assembly"&gt;</w:t>
+      </w:r>
+    </w:p>
+    <w:p>
+      <w:pPr>
+        <w:pStyle w:val="para7"/>
+      </w:pPr>
+      <w:r>
+        <w:t xml:space="preserve">        &lt;Found Context="routeData"&gt;</w:t>
+      </w:r>
+    </w:p>
+    <w:p>
+      <w:pPr>
+        <w:pStyle w:val="para7"/>
+        <w:rPr>
+          <w:color w:val="007f7f"/>
+        </w:rPr>
+      </w:pPr>
+      <w:r>
+        <w:rPr>
+          <w:color w:val="007f7f"/>
+        </w:rPr>
+        <w:t xml:space="preserve">            &lt;ErrorBoundary&gt;</w:t>
+      </w:r>
+    </w:p>
+    <w:p>
+      <w:pPr>
+        <w:pStyle w:val="para7"/>
+        <w:rPr>
+          <w:color w:val="007f7f"/>
+        </w:rPr>
+      </w:pPr>
+      <w:r>
+        <w:rPr>
+          <w:color w:val="007f7f"/>
+        </w:rPr>
+        <w:t xml:space="preserve">                &lt;ChildContent&gt;</w:t>
+      </w:r>
+    </w:p>
+    <w:p>
+      <w:pPr>
+        <w:pStyle w:val="para7"/>
+      </w:pPr>
+      <w:r>
+        <w:t xml:space="preserve">                    &lt;AuthorizeRouteView RouteData="@routeData" DefaultLayout="@typeof(MainLayout)"&gt;</w:t>
+      </w:r>
+    </w:p>
+    <w:p>
+      <w:pPr>
+        <w:pStyle w:val="para7"/>
+      </w:pPr>
+      <w:r>
+        <w:t xml:space="preserve">                        &lt;NotAuthorized&gt;</w:t>
+      </w:r>
+    </w:p>
+    <w:p>
+      <w:pPr>
+        <w:pStyle w:val="para7"/>
+      </w:pPr>
+      <w:r>
+        <w:t xml:space="preserve">                            &lt;h1 style="font-size:128px; margin-bottom: 2rem;"&gt;</w:t>
+      </w:r>
+      <w:r>
+        <w:rPr>
+          <w:noProof/>
+        </w:rPr>
+        <w:drawing>
+          <wp:inline distT="89535" distB="89535" distL="89535" distR="89535">
+            <wp:extent cx="89535" cy="88265"/>
+            <wp:effectExtent l="0" t="0" r="0" b="0"/>
+            <wp:docPr id="64" name="Picture207"/>
+            <wp:cNvGraphicFramePr>
+              <a:graphicFrameLocks xmlns:a="http://schemas.openxmlformats.org/drawingml/2006/main" noChangeAspect="1"/>
+            </wp:cNvGraphicFramePr>
+            <a:graphic xmlns:a="http://schemas.openxmlformats.org/drawingml/2006/main">
+              <a:graphicData uri="http://schemas.openxmlformats.org/drawingml/2006/picture">
+                <pic:pic xmlns:pic="http://schemas.openxmlformats.org/drawingml/2006/picture">
+                  <pic:nvPicPr>
+                    <pic:cNvPr id="64" name="Picture207"/>
+                    <pic:cNvPicPr>
+                      <a:picLocks noChangeAspect="1"/>
+                      <a:extLst>
+                        <a:ext uri="sm">
+                          <sm:smNativeData xmlns:sm="sm" val="SMDATA_17_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"/>
+                        </a:ext>
+                      </a:extLst>
+                    </pic:cNvPicPr>
+                  </pic:nvPicPr>
+                  <pic:blipFill>
+                    <a:blip r:embed="rId68"/>
+                    <a:stretch>
+                      <a:fillRect/>
+                    </a:stretch>
+                  </pic:blipFill>
+                  <pic:spPr>
+                    <a:xfrm>
+                      <a:off x="0" y="0"/>
+                      <a:ext cx="89535" cy="88265"/>
+                    </a:xfrm>
+                    <a:prstGeom prst="rect">
+                      <a:avLst/>
+                    </a:prstGeom>
+                    <a:noFill/>
+                    <a:ln w="12700">
+                      <a:noFill/>
+                    </a:ln>
+                  </pic:spPr>
+                </pic:pic>
+              </a:graphicData>
+            </a:graphic>
+          </wp:inline>
+        </w:drawing>
+      </w:r>
+      <w:r>
+        <w:t>&lt;/h1&gt;</w:t>
+      </w:r>
+    </w:p>
+    <w:p>
+      <w:pPr>
+        <w:pStyle w:val="para7"/>
+      </w:pPr>
+      <w:r>
+        <w:t xml:space="preserve">                            &lt;h1&gt;403 - You Shall Not Pass&lt;/h1&gt;</w:t>
+      </w:r>
+    </w:p>
+    <w:p>
+      <w:pPr>
+        <w:pStyle w:val="para7"/>
+      </w:pPr>
+      <w:r>
+        <w:t xml:space="preserve">                            &lt;p&gt;You are not allowed to access this page.&lt;/p&gt;</w:t>
+      </w:r>
+    </w:p>
+    <w:p>
+      <w:pPr>
+        <w:pStyle w:val="para7"/>
+      </w:pPr>
+      <w:r>
+        <w:t xml:space="preserve">                            &lt;p&gt;Please identify yourself.&lt;/p&gt;</w:t>
+      </w:r>
+    </w:p>
+    <w:p>
+      <w:pPr>
+        <w:pStyle w:val="para7"/>
+      </w:pPr>
+      <w:r>
+        <w:t xml:space="preserve">                        &lt;/NotAuthorized&gt;</w:t>
+      </w:r>
+    </w:p>
+    <w:p>
+      <w:pPr>
+        <w:pStyle w:val="para7"/>
+      </w:pPr>
+      <w:r>
+        <w:t xml:space="preserve">                        &lt;Authorizing&gt;</w:t>
+      </w:r>
+    </w:p>
+    <w:p>
+      <w:pPr>
+        <w:pStyle w:val="para7"/>
+      </w:pPr>
+      <w:r>
+        <w:t xml:space="preserve">                            &lt;h1 style="font-size:128px; margin-bottom: 2rem;"&gt;</w:t>
+      </w:r>
+      <w:r>
+        <w:rPr>
+          <w:noProof/>
+        </w:rPr>
+        <w:drawing>
+          <wp:inline distT="89535" distB="89535" distL="89535" distR="89535">
+            <wp:extent cx="89535" cy="88265"/>
+            <wp:effectExtent l="0" t="0" r="0" b="0"/>
+            <wp:docPr id="65" name="Picture209"/>
+            <wp:cNvGraphicFramePr>
+              <a:graphicFrameLocks xmlns:a="http://schemas.openxmlformats.org/drawingml/2006/main" noChangeAspect="1"/>
+            </wp:cNvGraphicFramePr>
+            <a:graphic xmlns:a="http://schemas.openxmlformats.org/drawingml/2006/main">
+              <a:graphicData uri="http://schemas.openxmlformats.org/drawingml/2006/picture">
+                <pic:pic xmlns:pic="http://schemas.openxmlformats.org/drawingml/2006/picture">
+                  <pic:nvPicPr>
+                    <pic:cNvPr id="65" name="Picture209"/>
+                    <pic:cNvPicPr>
+                      <a:picLocks noChangeAspect="1"/>
+                      <a:extLst>
+                        <a:ext uri="sm">
+                          <sm:smNativeData xmlns:sm="sm" val="SMDATA_17_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"/>
+                        </a:ext>
+                      </a:extLst>
+                    </pic:cNvPicPr>
+                  </pic:nvPicPr>
+                  <pic:blipFill>
+                    <a:blip r:embed="rId69"/>
+                    <a:stretch>
+                      <a:fillRect/>
+                    </a:stretch>
+                  </pic:blipFill>
+                  <pic:spPr>
+                    <a:xfrm>
+                      <a:off x="0" y="0"/>
+                      <a:ext cx="89535" cy="88265"/>
+                    </a:xfrm>
+                    <a:prstGeom prst="rect">
+                      <a:avLst/>
+                    </a:prstGeom>
+                    <a:noFill/>
+                    <a:ln w="12700">
+                      <a:noFill/>
+                    </a:ln>
+                  </pic:spPr>
+                </pic:pic>
+              </a:graphicData>
+            </a:graphic>
+          </wp:inline>
+        </w:drawing>
+      </w:r>
+      <w:r>
+        <w:t>&lt;/h1&gt;</w:t>
+      </w:r>
+    </w:p>
+    <w:p>
+      <w:pPr>
+        <w:pStyle w:val="para7"/>
+      </w:pPr>
+      <w:r>
+        <w:t xml:space="preserve">                            &lt;h1&gt;Authorizing&lt;/h1&gt;</w:t>
+      </w:r>
+    </w:p>
+    <w:p>
+      <w:pPr>
+        <w:pStyle w:val="para7"/>
+      </w:pPr>
+      <w:r>
+        <w:t xml:space="preserve">                            &lt;p&gt;I swear this won't take too long.&lt;/p&gt;</w:t>
+      </w:r>
+    </w:p>
+    <w:p>
+      <w:pPr>
+        <w:pStyle w:val="para7"/>
+      </w:pPr>
+      <w:r>
+        <w:t xml:space="preserve">                            &lt;p&gt;Please be patient.&lt;/p&gt;</w:t>
+      </w:r>
+    </w:p>
+    <w:p>
+      <w:pPr>
+        <w:pStyle w:val="para7"/>
+      </w:pPr>
+      <w:r>
+        <w:t xml:space="preserve">                        &lt;/Authorizing&gt;</w:t>
+      </w:r>
+    </w:p>
+    <w:p>
+      <w:pPr>
+        <w:pStyle w:val="para7"/>
+      </w:pPr>
+      <w:r>
+        <w:t xml:space="preserve">                    &lt;/AuthorizeRouteView&gt;</w:t>
+      </w:r>
+    </w:p>
+    <w:p>
+      <w:pPr>
+        <w:pStyle w:val="para7"/>
+      </w:pPr>
+      <w:r>
+        <w:t xml:space="preserve">                    &lt;PageTitle&gt;@routeData.PageType.Name&lt;/PageTitle&gt;</w:t>
+      </w:r>
+    </w:p>
+    <w:p>
+      <w:pPr>
+        <w:pStyle w:val="para7"/>
+      </w:pPr>
+      <w:r>
+        <w:t xml:space="preserve">                    &lt;RouteView RouteData="@routeData" DefaultLayout="@typeof(MainLayout)" /&gt;</w:t>
+      </w:r>
+    </w:p>
+    <w:p>
+      <w:pPr>
+        <w:pStyle w:val="para7"/>
+      </w:pPr>
+      <w:r>
+        <w:t xml:space="preserve">                    &lt;FocusOnNavigate RouteData="@routeData" Selector="h1" /&gt;</w:t>
+      </w:r>
+    </w:p>
+    <w:p>
+      <w:pPr>
+        <w:pStyle w:val="para7"/>
+        <w:rPr>
+          <w:color w:val="007f7f"/>
+        </w:rPr>
+      </w:pPr>
+      <w:r>
+        <w:rPr>
+          <w:color w:val="007f7f"/>
+        </w:rPr>
+        <w:t xml:space="preserve">                &lt;/ChildContent&gt;</w:t>
+      </w:r>
+    </w:p>
+    <w:p>
+      <w:pPr>
+        <w:pStyle w:val="para7"/>
+        <w:rPr>
+          <w:color w:val="007f7f"/>
+        </w:rPr>
+      </w:pPr>
+      <w:r>
+        <w:rPr>
+          <w:color w:val="007f7f"/>
+        </w:rPr>
+        <w:t xml:space="preserve">                &lt;ErrorContent&gt;</w:t>
+      </w:r>
+    </w:p>
+    <w:p>
+      <w:pPr>
+        <w:pStyle w:val="para7"/>
+        <w:rPr>
+          <w:color w:val="007f7f"/>
+        </w:rPr>
+      </w:pPr>
+      <w:r>
+        <w:rPr>
+          <w:color w:val="007f7f"/>
+        </w:rPr>
+        <w:t xml:space="preserve">                    &lt;LayoutView Layout="@typeof(MainLayout)"&gt;</w:t>
+      </w:r>
+    </w:p>
+    <w:p>
+      <w:pPr>
+        <w:pStyle w:val="para7"/>
+        <w:rPr>
+          <w:color w:val="007f7f"/>
+        </w:rPr>
+      </w:pPr>
+      <w:r>
+        <w:rPr>
+          <w:color w:val="007f7f"/>
+        </w:rPr>
+        <w:t xml:space="preserve">                        &lt;h1 style="font-size:128px; margin-bottom: 2rem;"&gt;</w:t>
+      </w:r>
+      <w:r>
+        <w:rPr>
+          <w:noProof/>
+        </w:rPr>
+        <w:drawing>
+          <wp:inline distT="89535" distB="89535" distL="89535" distR="89535">
+            <wp:extent cx="89535" cy="88265"/>
+            <wp:effectExtent l="0" t="0" r="0" b="0"/>
+            <wp:docPr id="66" name="Picture214"/>
+            <wp:cNvGraphicFramePr>
+              <a:graphicFrameLocks xmlns:a="http://schemas.openxmlformats.org/drawingml/2006/main" noChangeAspect="1"/>
+            </wp:cNvGraphicFramePr>
+            <a:graphic xmlns:a="http://schemas.openxmlformats.org/drawingml/2006/main">
+              <a:graphicData uri="http://schemas.openxmlformats.org/drawingml/2006/picture">
+                <pic:pic xmlns:pic="http://schemas.openxmlformats.org/drawingml/2006/picture">
+                  <pic:nvPicPr>
+                    <pic:cNvPr id="66" name="Picture214"/>
+                    <pic:cNvPicPr>
+                      <a:picLocks noChangeAspect="1"/>
+                      <a:codePr string="" type="-174920560" text="1"/>
+                      <a:extLst>
+                        <a:ext uri="sm">
+                          <sm:smNativeData xmlns:sm="sm" val="SMDATA_17_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"/>
+                        </a:ext>
+                      </a:extLst>
+                    </pic:cNvPicPr>
+                  </pic:nvPicPr>
+                  <pic:blipFill>
+                    <a:blip r:embed="rId70"/>
+                    <a:stretch>
+                      <a:fillRect/>
+                    </a:stretch>
+                  </pic:blipFill>
+                  <pic:spPr>
+                    <a:xfrm>
+                      <a:off x="0" y="0"/>
+                      <a:ext cx="89535" cy="88265"/>
+                    </a:xfrm>
+                    <a:prstGeom prst="rect">
+                      <a:avLst/>
+                    </a:prstGeom>
+                    <a:noFill/>
+                    <a:ln w="12700">
+                      <a:noFill/>
+                    </a:ln>
+                  </pic:spPr>
+                </pic:pic>
+              </a:graphicData>
+            </a:graphic>
+          </wp:inline>
+        </w:drawing>
+      </w:r>
+      <w:r>
+        <w:rPr>
+          <w:color w:val="007f7f"/>
+        </w:rPr>
+        <w:t>&lt;/h1&gt;</w:t>
+      </w:r>
+    </w:p>
+    <w:p>
+      <w:pPr>
+        <w:pStyle w:val="para7"/>
+        <w:rPr>
+          <w:color w:val="007f7f"/>
+        </w:rPr>
+      </w:pPr>
+      <w:r>
+        <w:rPr>
+          <w:color w:val="007f7f"/>
+        </w:rPr>
+        <w:t xml:space="preserve">                        &lt;h1&gt;Something went wrong...&lt;/h1&gt;</w:t>
+      </w:r>
+    </w:p>
+    <w:p>
+      <w:pPr>
+        <w:pStyle w:val="para7"/>
+        <w:rPr>
+          <w:color w:val="007f7f"/>
+        </w:rPr>
+      </w:pPr>
+      <w:r>
+        <w:rPr>
+          <w:color w:val="007f7f"/>
+        </w:rPr>
+        <w:t xml:space="preserve">                        &lt;p&gt;...but we're already working on it.&lt;/p&gt;</w:t>
+      </w:r>
+    </w:p>
+    <w:p>
+      <w:pPr>
+        <w:pStyle w:val="para7"/>
+        <w:rPr>
+          <w:color w:val="007f7f"/>
+        </w:rPr>
+      </w:pPr>
+      <w:r>
+        <w:rPr>
+          <w:color w:val="007f7f"/>
+        </w:rPr>
+        <w:t xml:space="preserve">                        &lt;p&gt;Help is on the way.&lt;/p&gt;</w:t>
+      </w:r>
+    </w:p>
+    <w:p>
+      <w:pPr>
+        <w:pStyle w:val="para7"/>
+        <w:rPr>
+          <w:color w:val="007f7f"/>
+        </w:rPr>
+      </w:pPr>
+      <w:r>
+        <w:rPr>
+          <w:color w:val="007f7f"/>
+        </w:rPr>
+        <w:t xml:space="preserve">                    &lt;/LayoutView&gt;</w:t>
+      </w:r>
+    </w:p>
+    <w:p>
+      <w:pPr>
+        <w:pStyle w:val="para7"/>
+        <w:rPr>
+          <w:color w:val="007f7f"/>
+        </w:rPr>
+      </w:pPr>
+      <w:r>
+        <w:rPr>
+          <w:color w:val="007f7f"/>
+        </w:rPr>
+        <w:t xml:space="preserve">                &lt;/ErrorContent&gt;</w:t>
+      </w:r>
+    </w:p>
+    <w:p>
+      <w:pPr>
+        <w:pStyle w:val="para7"/>
+        <w:rPr>
+          <w:color w:val="007f7f"/>
+        </w:rPr>
+      </w:pPr>
+      <w:r>
+        <w:rPr>
+          <w:color w:val="007f7f"/>
+        </w:rPr>
+        <w:t xml:space="preserve">            &lt;/ErrorBoundary&gt;</w:t>
+      </w:r>
+    </w:p>
+    <w:p>
+      <w:pPr>
+        <w:pStyle w:val="para7"/>
+      </w:pPr>
+      <w:r>
+        <w:t xml:space="preserve">        &lt;/Found&gt;</w:t>
+      </w:r>
+    </w:p>
+    <w:p>
+      <w:pPr>
+        <w:pStyle w:val="para7"/>
+      </w:pPr>
+      <w:r>
+        <w:t xml:space="preserve">        &lt;NotFound&gt;</w:t>
+      </w:r>
+    </w:p>
+    <w:p>
+      <w:pPr>
+        <w:pStyle w:val="para7"/>
+      </w:pPr>
+      <w:r>
+        <w:t xml:space="preserve">            &lt;PageTitle&gt;Not found&lt;/PageTitle&gt;</w:t>
+      </w:r>
+    </w:p>
+    <w:p>
+      <w:pPr>
+        <w:pStyle w:val="para7"/>
+      </w:pPr>
+      <w:r>
+        <w:t xml:space="preserve">            &lt;LayoutView Layout="@typeof(MainLayout)"&gt;</w:t>
+      </w:r>
+    </w:p>
+    <w:p>
+      <w:pPr>
+        <w:pStyle w:val="para7"/>
+      </w:pPr>
+      <w:r>
+        <w:t xml:space="preserve">                &lt;h1 style="font-size:128px; margin-bottom: 2rem;"&gt;</w:t>
+      </w:r>
+      <w:r>
+        <w:rPr>
+          <w:noProof/>
+        </w:rPr>
+        <w:drawing>
+          <wp:inline distT="89535" distB="89535" distL="89535" distR="89535">
+            <wp:extent cx="89535" cy="88265"/>
+            <wp:effectExtent l="0" t="0" r="0" b="0"/>
+            <wp:docPr id="67" name="Picture208"/>
+            <wp:cNvGraphicFramePr>
+              <a:graphicFrameLocks xmlns:a="http://schemas.openxmlformats.org/drawingml/2006/main" noChangeAspect="1"/>
+            </wp:cNvGraphicFramePr>
+            <a:graphic xmlns:a="http://schemas.openxmlformats.org/drawingml/2006/main">
+              <a:graphicData uri="http://schemas.openxmlformats.org/drawingml/2006/picture">
+                <pic:pic xmlns:pic="http://schemas.openxmlformats.org/drawingml/2006/picture">
+                  <pic:nvPicPr>
+                    <pic:cNvPr id="67" name="Picture208"/>
+                    <pic:cNvPicPr>
+                      <a:picLocks noChangeAspect="1"/>
+                      <a:extLst>
+                        <a:ext uri="sm">
+                          <sm:smNativeData xmlns:sm="sm" val="SMDATA_17_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"/>
+                        </a:ext>
+                      </a:extLst>
+                    </pic:cNvPicPr>
+                  </pic:nvPicPr>
+                  <pic:blipFill>
+                    <a:blip r:embed="rId67"/>
+                    <a:stretch>
+                      <a:fillRect/>
+                    </a:stretch>
+                  </pic:blipFill>
+                  <pic:spPr>
+                    <a:xfrm>
+                      <a:off x="0" y="0"/>
+                      <a:ext cx="89535" cy="88265"/>
+                    </a:xfrm>
+                    <a:prstGeom prst="rect">
+                      <a:avLst/>
+                    </a:prstGeom>
+                    <a:noFill/>
+                    <a:ln w="12700">
+                      <a:noFill/>
+                    </a:ln>
+                  </pic:spPr>
+                </pic:pic>
+              </a:graphicData>
+            </a:graphic>
+          </wp:inline>
+        </w:drawing>
+      </w:r>
+      <w:r>
+        <w:t>&lt;/h1&gt;</w:t>
+      </w:r>
+    </w:p>
+    <w:p>
+      <w:pPr>
+        <w:pStyle w:val="para7"/>
+      </w:pPr>
+      <w:r>
+        <w:t xml:space="preserve">                &lt;h1&gt;404 – R.I.P.&lt;/h1&gt;</w:t>
+      </w:r>
+    </w:p>
+    <w:p>
+      <w:pPr>
+        <w:pStyle w:val="para7"/>
+      </w:pPr>
+      <w:r>
+        <w:t xml:space="preserve">                &lt;p&gt;This page is no longer among us.&lt;/p&gt;</w:t>
+      </w:r>
+    </w:p>
+    <w:p>
+      <w:pPr>
+        <w:pStyle w:val="para7"/>
+      </w:pPr>
+      <w:r>
+        <w:t xml:space="preserve">                &lt;p&gt;Please keep the faith.&lt;/p&gt;</w:t>
+      </w:r>
+    </w:p>
+    <w:p>
+      <w:pPr>
+        <w:pStyle w:val="para7"/>
+      </w:pPr>
+      <w:r>
+        <w:t xml:space="preserve">            &lt;/LayoutView&gt;</w:t>
+      </w:r>
+    </w:p>
+    <w:p>
+      <w:pPr>
+        <w:pStyle w:val="para7"/>
+      </w:pPr>
+      <w:r>
+        <w:t xml:space="preserve">        &lt;/NotFound&gt;</w:t>
+      </w:r>
+    </w:p>
+    <w:p>
+      <w:pPr>
+        <w:pStyle w:val="para7"/>
+      </w:pPr>
+      <w:r>
+        <w:t xml:space="preserve">    &lt;/Router&gt;</w:t>
+      </w:r>
+    </w:p>
+    <w:p>
+      <w:pPr>
+        <w:pStyle w:val="para7"/>
+      </w:pPr>
+      <w:r>
+        <w:t>&lt;/CascadingAuthenticationState&gt;</w:t>
+      </w:r>
+    </w:p>
+    <w:p>
+      <w:pPr>
+        <w:pStyle w:val="para19"/>
+      </w:pPr>
+      <w:r>
+        <w:t xml:space="preserve">Il componente ErrorBoundary non intercetta automaticamente gli errori HTTP, come un errore 500 (Internal Server Error) proveniente da una chiamata API. Lato </w:t>
+      </w:r>
+      <w:r>
+        <w:rPr>
+          <w:rStyle w:val="char4"/>
+          <w:i/>
+        </w:rPr>
+        <w:t>client</w:t>
+      </w:r>
+      <w:r>
+        <w:t xml:space="preserve"> una chiamata API non genera eccezioni, restituisce solo dei codici di stato.</w:t>
+      </w:r>
+    </w:p>
+    <w:p>
+      <w:pPr>
+        <w:pStyle w:val="para2"/>
+      </w:pPr>
+      <w:r>
+        <w:t>Avviamento del programma</w:t>
+      </w:r>
+    </w:p>
+    <w:p>
+      <w:pPr>
+        <w:pStyle w:val="para2"/>
+      </w:pPr>
+      <w:r>
+        <w:t>Localizzazione</w:t>
       </w:r>
     </w:p>
     <w:sectPr>
@@ -33054,7 +34833,7 @@
     <w:name w:val="Bullet 3"/>
     <w:lvl w:ilvl="0">
       <w:numFmt w:val="bullet"/>
-      <w:pStyle w:val="para23"/>
+      <w:pStyle w:val="para22"/>
       <w:suff w:val="tab"/>
       <w:lvlText w:val=""/>
       <w:lvlJc w:val="left"/>
@@ -33166,13 +34945,11 @@
     <w:name w:val="Bullet 12"/>
     <w:lvl w:ilvl="0">
       <w:numFmt w:val="bullet"/>
+      <w:suff w:val="tab"/>
       <w:lvlText w:val=""/>
       <w:lvlJc w:val="left"/>
       <w:pPr>
-        <w:tabs>
-          <w:tab w:val="num" w:pos="283"/>
-        </w:tabs>
-        <w:ind w:left="283" w:hanging="283"/>
+        <w:ind w:left="0" w:hanging="0"/>
       </w:pPr>
       <w:rPr>
         <w:rFonts w:ascii="Wingdings" w:hAnsi="Wingdings" w:eastAsia="Wingdings" w:cs="Wingdings"/>
@@ -33184,13 +34961,11 @@
     <w:name w:val="Bullet 13"/>
     <w:lvl w:ilvl="0">
       <w:numFmt w:val="bullet"/>
+      <w:suff w:val="tab"/>
       <w:lvlText w:val=""/>
       <w:lvlJc w:val="left"/>
       <w:pPr>
-        <w:tabs>
-          <w:tab w:val="num" w:pos="567"/>
-        </w:tabs>
-        <w:ind w:left="567" w:hanging="567"/>
+        <w:ind w:left="0" w:hanging="0"/>
       </w:pPr>
       <w:rPr>
         <w:rFonts w:ascii="Wingdings" w:hAnsi="Wingdings" w:eastAsia="Wingdings" w:cs="Wingdings"/>
@@ -33638,6 +35413,9 @@
   <w:style w:type="paragraph" w:styleId="para0" w:default="1">
     <w:name w:val="Normal"/>
     <w:qFormat/>
+    <w:rPr>
+      <w:rFonts w:ascii="Roboto Serif 28pt Thin" w:hAnsi="Roboto Serif 28pt Thin" w:eastAsia="Roboto Serif 28pt Thin" w:cs="Roboto Serif 28pt Thin"/>
+    </w:rPr>
   </w:style>
   <w:style w:type="paragraph" w:styleId="para1">
     <w:name w:val="heading 1"/>
@@ -33783,9 +35561,6 @@
     <w:name w:val="Folder"/>
     <w:qFormat/>
     <w:basedOn w:val="para0"/>
-    <w:rPr>
-      <w:rFonts w:ascii="Victor Mono" w:hAnsi="Victor Mono" w:eastAsia="Victor Mono" w:cs="Victor Mono"/>
-    </w:rPr>
   </w:style>
   <w:style w:type="paragraph" w:styleId="para10">
     <w:name w:val="Title"/>
@@ -33969,7 +35744,7 @@
       <w:szCs w:val="20"/>
     </w:rPr>
   </w:style>
-  <w:style w:type="paragraph" w:styleId="para23" w:customStyle="1">
+  <w:style w:type="paragraph" w:styleId="para22" w:customStyle="1">
     <w:name w:val="cls-list-bullet-blue"/>
     <w:qFormat/>
     <w:basedOn w:val="para5"/>
@@ -34046,7 +35821,7 @@
     <w:name w:val="cls-text-technology"/>
     <w:basedOnNormal/>
     <w:rPr>
-      <w:rFonts w:ascii="Roboto Condensed Medium" w:hAnsi="Roboto Condensed Medium" w:eastAsia="Roboto Condensed Medium" w:cs="Roboto Condensed Medium"/>
+      <w:rFonts w:ascii="Roboto Serif 36pt" w:hAnsi="Roboto Serif 36pt" w:eastAsia="Roboto Serif 36pt" w:cs="Roboto Serif 36pt"/>
     </w:rPr>
   </w:style>
   <w:style w:type="character" w:styleId="char9" w:customStyle="1">
@@ -34585,6 +36360,9 @@
   <w:style w:type="paragraph" w:styleId="para0" w:default="1">
     <w:name w:val="Normal"/>
     <w:qFormat/>
+    <w:rPr>
+      <w:rFonts w:ascii="Roboto Serif 28pt Thin" w:hAnsi="Roboto Serif 28pt Thin" w:eastAsia="Roboto Serif 28pt Thin" w:cs="Roboto Serif 28pt Thin"/>
+    </w:rPr>
   </w:style>
   <w:style w:type="paragraph" w:styleId="para1">
     <w:name w:val="heading 1"/>
@@ -34730,9 +36508,6 @@
     <w:name w:val="Folder"/>
     <w:qFormat/>
     <w:basedOn w:val="para0"/>
-    <w:rPr>
-      <w:rFonts w:ascii="Victor Mono" w:hAnsi="Victor Mono" w:eastAsia="Victor Mono" w:cs="Victor Mono"/>
-    </w:rPr>
   </w:style>
   <w:style w:type="paragraph" w:styleId="para10">
     <w:name w:val="Title"/>
@@ -34916,7 +36691,7 @@
       <w:szCs w:val="20"/>
     </w:rPr>
   </w:style>
-  <w:style w:type="paragraph" w:styleId="para23" w:customStyle="1">
+  <w:style w:type="paragraph" w:styleId="para22" w:customStyle="1">
     <w:name w:val="cls-list-bullet-blue"/>
     <w:qFormat/>
     <w:basedOn w:val="para5"/>
@@ -34993,7 +36768,7 @@
     <w:name w:val="cls-text-technology"/>
     <w:basedOnNormal/>
     <w:rPr>
-      <w:rFonts w:ascii="Roboto Condensed Medium" w:hAnsi="Roboto Condensed Medium" w:eastAsia="Roboto Condensed Medium" w:cs="Roboto Condensed Medium"/>
+      <w:rFonts w:ascii="Roboto Serif 36pt" w:hAnsi="Roboto Serif 36pt" w:eastAsia="Roboto Serif 36pt" w:cs="Roboto Serif 36pt"/>
     </w:rPr>
   </w:style>
   <w:style w:type="character" w:styleId="char9" w:customStyle="1">
@@ -35184,9 +36959,9 @@
         <a:cs typeface="Fira Sans Heavy"/>
       </a:majorFont>
       <a:minorFont>
-        <a:latin typeface="Roboto Condensed ExtraLight"/>
-        <a:ea typeface="Roboto Condensed ExtraLight"/>
-        <a:cs typeface="Roboto Condensed ExtraLight"/>
+        <a:latin typeface="Roboto Serif 28pt Thin"/>
+        <a:ea typeface="Roboto Serif 28pt Thin"/>
+        <a:cs typeface="Roboto Serif 28pt Thin"/>
       </a:minorFont>
     </a:fontScheme>
     <a:fmtScheme name="Office">

</xml_diff>